<commit_message>
Completed results summary and analysis
</commit_message>
<xml_diff>
--- a/recognition/UNet_HipMRI_s48028293/Report.docx
+++ b/recognition/UNet_HipMRI_s48028293/Report.docx
@@ -1051,7 +1051,7 @@
         </w:tc>
         <w:tc>
           <w:tcPr>
-            <w:tcW w:w="4120" w:type="dxa"/>
+            <w:tcW w:w="4121" w:type="dxa"/>
             <w:vAlign w:val="center"/>
           </w:tcPr>
           <w:p>
@@ -1103,7 +1103,7 @@
         </w:tc>
         <w:tc>
           <w:tcPr>
-            <w:tcW w:w="4120" w:type="dxa"/>
+            <w:tcW w:w="4121" w:type="dxa"/>
             <w:vAlign w:val="center"/>
           </w:tcPr>
           <w:p>
@@ -1241,7 +1241,7 @@
         </w:tc>
         <w:tc>
           <w:tcPr>
-            <w:tcW w:w="4120" w:type="dxa"/>
+            <w:tcW w:w="4121" w:type="dxa"/>
             <w:vAlign w:val="center"/>
           </w:tcPr>
           <w:p>
@@ -1300,18 +1300,8 @@
         </w:tc>
         <w:tc>
           <w:tcPr>
-            <w:tcW w:w="3453" w:type="dxa"/>
-            <w:vAlign w:val="center"/>
-          </w:tcPr>
-          <w:p>
-            <w:r>
-              <w:t>No leakage detected</w:t>
-            </w:r>
-          </w:p>
-        </w:tc>
-        <w:tc>
-          <w:tcPr>
-            <w:tcW w:w="4120" w:type="dxa"/>
+            <w:tcW w:w="7574" w:type="dxa"/>
+            <w:gridSpan w:val="2"/>
             <w:vAlign w:val="center"/>
           </w:tcPr>
           <w:p>
@@ -1395,7 +1385,13 @@
         <w:t xml:space="preserve">The data processing pipeline used </w:t>
       </w:r>
       <w:r>
-        <w:t xml:space="preserve">for the 3D Improved-UNet </w:t>
+        <w:t>for the 3D Improved</w:t>
+      </w:r>
+      <w:r>
+        <w:t xml:space="preserve"> U-</w:t>
+      </w:r>
+      <w:r>
+        <w:t xml:space="preserve">Net </w:t>
       </w:r>
       <w:r>
         <w:t>is as follows:</w:t>
@@ -1451,13 +1447,13 @@
         <w:t>Down sampling</w:t>
       </w:r>
       <w:r>
-        <w:t>:</w:t>
-      </w:r>
-      <w:r>
-        <w:t xml:space="preserve"> Each image and label has been down sampled to (2,2,1)</w:t>
-      </w:r>
-      <w:r>
-        <w:t>.</w:t>
+        <w:t xml:space="preserve">: </w:t>
+      </w:r>
+      <w:r>
+        <w:t>Down sample each</w:t>
+      </w:r>
+      <w:r>
+        <w:t xml:space="preserve"> image and label to (2,2,1).</w:t>
       </w:r>
     </w:p>
     <w:p>
@@ -1491,7 +1487,13 @@
         <w:t>:</w:t>
       </w:r>
       <w:r>
-        <w:t xml:space="preserve"> The labels are converted to 6 one-hot channels </w:t>
+        <w:t xml:space="preserve"> The labels </w:t>
+      </w:r>
+      <w:r>
+        <w:t>were</w:t>
+      </w:r>
+      <w:r>
+        <w:t xml:space="preserve"> converted to 6 one-hot channels </w:t>
       </w:r>
     </w:p>
     <w:p>
@@ -1826,13 +1828,7 @@
         <w:t xml:space="preserve"> is the prostate DSC score </w:t>
       </w:r>
       <w:r>
-        <w:t>of</w:t>
-      </w:r>
-      <w:r>
-        <w:t xml:space="preserve"> the superior (base) and inferior (apex) slices</w:t>
-      </w:r>
-      <w:r>
-        <w:t xml:space="preserve">. </w:t>
+        <w:t xml:space="preserve">of the superior (base) and inferior (apex) slices. </w:t>
       </w:r>
       <w:r>
         <w:t xml:space="preserve">Additional metrics include the training curves, peak GPU VRAM, per-case inference time, </w:t>
@@ -1879,55 +1875,145 @@
         <w:t xml:space="preserve"> for failure cases)</w:t>
       </w:r>
       <w:r>
-        <w:t>:</w:t>
+        <w:t xml:space="preserve">. The model trained in 17.1 mins, with an average inference time of 0.048s. The training curves </w:t>
+      </w:r>
+      <w:r>
+        <w:t xml:space="preserve">in Figure # </w:t>
+      </w:r>
+      <w:r>
+        <w:t>indicate that the model</w:t>
+      </w:r>
+      <w:r>
+        <w:t xml:space="preserve"> training was most successful in the early epochs of training, and the validation loss stabilised at approximately 0.3 as the training curve continued to improve, suggesting possible overfitting on the training data set. However. The validation dice scores per class increased during the early epochs and then stabilised. </w:t>
+      </w:r>
+    </w:p>
+    <w:p>
+      <w:r>
+        <w:t xml:space="preserve">Figure # is the most critical measure of the models baseline performance for this investigation, with a focus on the </w:t>
+      </w:r>
+      <w:r>
+        <w:t>end slices located in bins 0 and 9</w:t>
+      </w:r>
+      <w:r>
+        <w:t>,</w:t>
+      </w:r>
+      <w:r>
+        <w:t xml:space="preserve"> as these</w:t>
       </w:r>
       <w:r>
         <w:t xml:space="preserve"> </w:t>
       </w:r>
-    </w:p>
-    <w:p>
-      <w:pPr>
-        <w:spacing w:after="0"/>
+      <w:r>
+        <w:t>are</w:t>
+      </w:r>
+      <w:r>
+        <w:t xml:space="preserve"> the superior and inferior prostate MRI slices</w:t>
+      </w:r>
+      <w:r>
+        <w:t xml:space="preserve">, </w:t>
+      </w:r>
+      <w:r>
+        <w:t>where</w:t>
+      </w:r>
+      <w:r>
+        <w:t xml:space="preserve"> over and under contouring of the prostate can occur. </w:t>
+      </w:r>
+      <w:r>
+        <w:t>The first slice recorded a prostate dice score of 0.524</w:t>
+      </w:r>
+      <w:r>
+        <w:t xml:space="preserve">, and the last slice a prostate dice score of 0.440. </w:t>
+      </w:r>
+      <w:r>
+        <w:t xml:space="preserve">An average dice score of 0.885 was recorded for the prostate across all slices, indicating the model was </w:t>
+      </w:r>
+      <w:r>
+        <w:t>poor</w:t>
+      </w:r>
+      <w:r>
+        <w:t xml:space="preserve"> </w:t>
+      </w:r>
+      <w:r>
+        <w:t>at</w:t>
+      </w:r>
+      <w:r>
+        <w:t xml:space="preserve"> correctly predict</w:t>
+      </w:r>
+      <w:r>
+        <w:t xml:space="preserve">ing </w:t>
+      </w:r>
+      <w:r>
+        <w:t>the prostate class on the end slice locations</w:t>
+      </w:r>
+      <w:r>
+        <w:t xml:space="preserve"> specifically. </w:t>
+      </w:r>
+    </w:p>
+    <w:p>
+      <w:r>
+        <w:rPr>
+          <w:noProof/>
+        </w:rPr>
+        <w:drawing>
+          <wp:inline distT="0" distB="0" distL="0" distR="0" wp14:anchorId="22BE2E6D" wp14:editId="48590ADE">
+            <wp:extent cx="5619591" cy="1873404"/>
+            <wp:effectExtent l="0" t="0" r="635" b="0"/>
+            <wp:docPr id="988667139" name="Picture 6"/>
+            <wp:cNvGraphicFramePr>
+              <a:graphicFrameLocks xmlns:a="http://schemas.openxmlformats.org/drawingml/2006/main" noChangeAspect="1"/>
+            </wp:cNvGraphicFramePr>
+            <a:graphic xmlns:a="http://schemas.openxmlformats.org/drawingml/2006/main">
+              <a:graphicData uri="http://schemas.openxmlformats.org/drawingml/2006/picture">
+                <pic:pic xmlns:pic="http://schemas.openxmlformats.org/drawingml/2006/picture">
+                  <pic:nvPicPr>
+                    <pic:cNvPr id="0" name="Picture 20"/>
+                    <pic:cNvPicPr>
+                      <a:picLocks noChangeAspect="1" noChangeArrowheads="1"/>
+                    </pic:cNvPicPr>
+                  </pic:nvPicPr>
+                  <pic:blipFill>
+                    <a:blip r:embed="rId5" cstate="print">
+                      <a:extLst>
+                        <a:ext uri="{28A0092B-C50C-407E-A947-70E740481C1C}">
+                          <a14:useLocalDpi xmlns:a14="http://schemas.microsoft.com/office/drawing/2010/main" val="0"/>
+                        </a:ext>
+                      </a:extLst>
+                    </a:blip>
+                    <a:srcRect/>
+                    <a:stretch>
+                      <a:fillRect/>
+                    </a:stretch>
+                  </pic:blipFill>
+                  <pic:spPr bwMode="auto">
+                    <a:xfrm>
+                      <a:off x="0" y="0"/>
+                      <a:ext cx="5662024" cy="1887550"/>
+                    </a:xfrm>
+                    <a:prstGeom prst="rect">
+                      <a:avLst/>
+                    </a:prstGeom>
+                    <a:noFill/>
+                    <a:ln>
+                      <a:noFill/>
+                    </a:ln>
+                  </pic:spPr>
+                </pic:pic>
+              </a:graphicData>
+            </a:graphic>
+          </wp:inline>
+        </w:drawing>
+      </w:r>
+    </w:p>
+    <w:p>
+      <w:pPr>
         <w:jc w:val="center"/>
       </w:pPr>
       <w:r>
-        <w:t>Training time: 17.1 min</w:t>
-      </w:r>
-    </w:p>
-    <w:p>
-      <w:pPr>
-        <w:spacing w:after="0"/>
-        <w:jc w:val="center"/>
-      </w:pPr>
-      <w:r>
-        <w:t>Peak VRAM, training:  3465 MiB (batch size 32)</w:t>
-      </w:r>
-    </w:p>
-    <w:p>
-      <w:pPr>
-        <w:spacing w:after="0"/>
-        <w:jc w:val="center"/>
-      </w:pPr>
-      <w:r>
-        <w:t>Peak VRAM, inference: 1454 MiB (batch size 32)</w:t>
-      </w:r>
-    </w:p>
-    <w:p>
-      <w:pPr>
-        <w:spacing w:after="0"/>
-        <w:jc w:val="center"/>
-      </w:pPr>
-      <w:r>
-        <w:t>Inference time per case: 0.048 s (model forward only)</w:t>
-      </w:r>
-    </w:p>
-    <w:p>
-      <w:pPr>
-        <w:jc w:val="center"/>
-      </w:pPr>
-      <w:r>
+        <w:rPr>
+          <w:noProof/>
+        </w:rPr>
         <w:drawing>
-          <wp:inline distT="0" distB="0" distL="0" distR="0" wp14:anchorId="3DE64377" wp14:editId="0E5C0CEF">
+          <wp:inline distT="0" distB="0" distL="0" distR="0" wp14:anchorId="257C2F4A" wp14:editId="282EFDA8">
             <wp:extent cx="4026537" cy="2301006"/>
             <wp:effectExtent l="0" t="0" r="0" b="4445"/>
             <wp:docPr id="562946213" name="Picture 2"/>
@@ -1944,7 +2030,7 @@
                     </pic:cNvPicPr>
                   </pic:nvPicPr>
                   <pic:blipFill>
-                    <a:blip r:embed="rId5" cstate="print">
+                    <a:blip r:embed="rId6" cstate="print">
                       <a:extLst>
                         <a:ext uri="{28A0092B-C50C-407E-A947-70E740481C1C}">
                           <a14:useLocalDpi xmlns:a14="http://schemas.microsoft.com/office/drawing/2010/main" val="0"/>
@@ -1977,15 +2063,80 @@
       </w:r>
     </w:p>
     <w:p>
+      <w:r>
+        <w:t>In comparison, the 3D Improved</w:t>
+      </w:r>
+      <w:r>
+        <w:t xml:space="preserve"> </w:t>
+      </w:r>
+      <w:r>
+        <w:t>U</w:t>
+      </w:r>
+      <w:r>
+        <w:t>-</w:t>
+      </w:r>
+      <w:r>
+        <w:t>Net model produced the following results</w:t>
+      </w:r>
+      <w:r>
+        <w:t xml:space="preserve"> </w:t>
+      </w:r>
+      <w:r>
+        <w:t>(refer to Appendix 8.1 for failure cases).</w:t>
+      </w:r>
+      <w:r>
+        <w:t xml:space="preserve"> The model trains in 22.6 minutes, with an average inference time of 0.018 seconds. </w:t>
+      </w:r>
+      <w:r>
+        <w:t xml:space="preserve">Figure # depicts the training curves for the model, and indicate an improved performance, with the training and validation curves loss both decreasing substantially as the epochs continue. </w:t>
+      </w:r>
+      <w:r>
+        <w:t xml:space="preserve">Similarly, the validation dice scores per class during training suggest efficient training across all the different classes. </w:t>
+      </w:r>
+    </w:p>
+    <w:p>
+      <w:r>
+        <w:lastRenderedPageBreak/>
+        <w:t xml:space="preserve"> Figure # demonstrates the prostate dice scores across each MRI slice, with an average score of </w:t>
+      </w:r>
+      <w:r>
+        <w:t>0.</w:t>
+      </w:r>
+      <w:r>
+        <w:t>87</w:t>
+      </w:r>
+      <w:r>
+        <w:t xml:space="preserve">3 recorded. The apex slice had a dice score of 0.697 and the base slice a dice score of 0.725. These scores indicate a strong improvement in model performance at the </w:t>
+      </w:r>
+      <w:r>
+        <w:t>superior and inferior slices</w:t>
+      </w:r>
+      <w:r>
+        <w:t xml:space="preserve">, with the 3D Improved U-Net </w:t>
+      </w:r>
+      <w:r>
+        <w:t xml:space="preserve">model being more effective at correctly classifying the prostate pixels </w:t>
+      </w:r>
+      <w:r>
+        <w:t xml:space="preserve">at these challenging locations </w:t>
+      </w:r>
+      <w:r>
+        <w:t xml:space="preserve">than the baseline model. </w:t>
+      </w:r>
+    </w:p>
+    <w:p>
       <w:pPr>
         <w:jc w:val="center"/>
       </w:pPr>
       <w:r>
+        <w:rPr>
+          <w:noProof/>
+        </w:rPr>
         <w:drawing>
-          <wp:inline distT="0" distB="0" distL="0" distR="0" wp14:anchorId="22BE2E6D" wp14:editId="48590ADE">
-            <wp:extent cx="5619591" cy="1873404"/>
-            <wp:effectExtent l="0" t="0" r="635" b="0"/>
-            <wp:docPr id="988667139" name="Picture 6"/>
+          <wp:inline distT="0" distB="0" distL="0" distR="0" wp14:anchorId="2E875740" wp14:editId="6ECC2C76">
+            <wp:extent cx="5731510" cy="1910715"/>
+            <wp:effectExtent l="0" t="0" r="2540" b="0"/>
+            <wp:docPr id="1397560710" name="Picture 9"/>
             <wp:cNvGraphicFramePr>
               <a:graphicFrameLocks xmlns:a="http://schemas.openxmlformats.org/drawingml/2006/main" noChangeAspect="1"/>
             </wp:cNvGraphicFramePr>
@@ -1993,13 +2144,13 @@
               <a:graphicData uri="http://schemas.openxmlformats.org/drawingml/2006/picture">
                 <pic:pic xmlns:pic="http://schemas.openxmlformats.org/drawingml/2006/picture">
                   <pic:nvPicPr>
-                    <pic:cNvPr id="0" name="Picture 20"/>
+                    <pic:cNvPr id="0" name="Picture 26"/>
                     <pic:cNvPicPr>
                       <a:picLocks noChangeAspect="1" noChangeArrowheads="1"/>
                     </pic:cNvPicPr>
                   </pic:nvPicPr>
                   <pic:blipFill>
-                    <a:blip r:embed="rId6" cstate="print">
+                    <a:blip r:embed="rId7" cstate="print">
                       <a:extLst>
                         <a:ext uri="{28A0092B-C50C-407E-A947-70E740481C1C}">
                           <a14:useLocalDpi xmlns:a14="http://schemas.microsoft.com/office/drawing/2010/main" val="0"/>
@@ -2014,7 +2165,7 @@
                   <pic:spPr bwMode="auto">
                     <a:xfrm>
                       <a:off x="0" y="0"/>
-                      <a:ext cx="5662024" cy="1887550"/>
+                      <a:ext cx="5731510" cy="1910715"/>
                     </a:xfrm>
                     <a:prstGeom prst="rect">
                       <a:avLst/>
@@ -2032,69 +2183,15 @@
       </w:r>
     </w:p>
     <w:p>
-      <w:r>
-        <w:t>In comparison, the 3D Improved</w:t>
-      </w:r>
-      <w:r>
-        <w:t xml:space="preserve"> </w:t>
-      </w:r>
-      <w:r>
-        <w:t>U</w:t>
-      </w:r>
-      <w:r>
-        <w:t>-</w:t>
-      </w:r>
-      <w:r>
-        <w:t>Net model produced the following results:</w:t>
-      </w:r>
-    </w:p>
-    <w:p>
-      <w:pPr>
-        <w:spacing w:after="0"/>
+      <w:pPr>
         <w:jc w:val="center"/>
       </w:pPr>
       <w:r>
-        <w:t>Training time: 22.6 min</w:t>
-      </w:r>
-    </w:p>
-    <w:p>
-      <w:pPr>
-        <w:spacing w:after="0"/>
-        <w:jc w:val="center"/>
-      </w:pPr>
-      <w:r>
-        <w:t>Peak VRAM, training:  4260 MiB (batch size 2)</w:t>
-      </w:r>
-    </w:p>
-    <w:p>
-      <w:pPr>
-        <w:spacing w:after="0"/>
-        <w:jc w:val="center"/>
-      </w:pPr>
-      <w:r>
-        <w:t>Peak VRAM, inference: 1729 MiB (batch size 2)</w:t>
-      </w:r>
-    </w:p>
-    <w:p>
-      <w:pPr>
-        <w:spacing w:after="0"/>
-        <w:jc w:val="center"/>
-      </w:pPr>
-      <w:r>
-        <w:t>Inference time per case: 0.018 s (model forward only)</w:t>
-      </w:r>
-    </w:p>
-    <w:p>
-      <w:pPr>
-        <w:jc w:val="center"/>
-      </w:pPr>
-      <w:r>
         <w:rPr>
           <w:noProof/>
         </w:rPr>
-        <w:lastRenderedPageBreak/>
         <w:drawing>
-          <wp:inline distT="0" distB="0" distL="0" distR="0" wp14:anchorId="70F0FF60" wp14:editId="29D292F2">
+          <wp:inline distT="0" distB="0" distL="0" distR="0" wp14:anchorId="48E4354E" wp14:editId="75DDCB9F">
             <wp:extent cx="4033831" cy="2305174"/>
             <wp:effectExtent l="0" t="0" r="5080" b="0"/>
             <wp:docPr id="846199533" name="Picture 8"/>
@@ -2111,7 +2208,7 @@
                     </pic:cNvPicPr>
                   </pic:nvPicPr>
                   <pic:blipFill>
-                    <a:blip r:embed="rId7" cstate="print">
+                    <a:blip r:embed="rId8" cstate="print">
                       <a:extLst>
                         <a:ext uri="{28A0092B-C50C-407E-A947-70E740481C1C}">
                           <a14:useLocalDpi xmlns:a14="http://schemas.microsoft.com/office/drawing/2010/main" val="0"/>
@@ -2144,66 +2241,333 @@
       </w:r>
     </w:p>
     <w:p>
-      <w:pPr>
-        <w:jc w:val="center"/>
-      </w:pPr>
-      <w:r>
-        <w:rPr>
-          <w:noProof/>
-        </w:rPr>
-        <w:drawing>
-          <wp:inline distT="0" distB="0" distL="0" distR="0" wp14:anchorId="2E875740" wp14:editId="6ECC2C76">
-            <wp:extent cx="5731510" cy="1910715"/>
-            <wp:effectExtent l="0" t="0" r="2540" b="0"/>
-            <wp:docPr id="1397560710" name="Picture 9"/>
-            <wp:cNvGraphicFramePr>
-              <a:graphicFrameLocks xmlns:a="http://schemas.openxmlformats.org/drawingml/2006/main" noChangeAspect="1"/>
-            </wp:cNvGraphicFramePr>
-            <a:graphic xmlns:a="http://schemas.openxmlformats.org/drawingml/2006/main">
-              <a:graphicData uri="http://schemas.openxmlformats.org/drawingml/2006/picture">
-                <pic:pic xmlns:pic="http://schemas.openxmlformats.org/drawingml/2006/picture">
-                  <pic:nvPicPr>
-                    <pic:cNvPr id="0" name="Picture 26"/>
-                    <pic:cNvPicPr>
-                      <a:picLocks noChangeAspect="1" noChangeArrowheads="1"/>
-                    </pic:cNvPicPr>
-                  </pic:nvPicPr>
-                  <pic:blipFill>
-                    <a:blip r:embed="rId8" cstate="print">
-                      <a:extLst>
-                        <a:ext uri="{28A0092B-C50C-407E-A947-70E740481C1C}">
-                          <a14:useLocalDpi xmlns:a14="http://schemas.microsoft.com/office/drawing/2010/main" val="0"/>
-                        </a:ext>
-                      </a:extLst>
-                    </a:blip>
-                    <a:srcRect/>
-                    <a:stretch>
-                      <a:fillRect/>
-                    </a:stretch>
-                  </pic:blipFill>
-                  <pic:spPr bwMode="auto">
-                    <a:xfrm>
-                      <a:off x="0" y="0"/>
-                      <a:ext cx="5731510" cy="1910715"/>
-                    </a:xfrm>
-                    <a:prstGeom prst="rect">
-                      <a:avLst/>
-                    </a:prstGeom>
-                    <a:noFill/>
-                    <a:ln>
-                      <a:noFill/>
-                    </a:ln>
-                  </pic:spPr>
-                </pic:pic>
-              </a:graphicData>
-            </a:graphic>
-          </wp:inline>
-        </w:drawing>
-      </w:r>
-    </w:p>
-    <w:p>
-      <w:r>
-        <w:t>The prostate dice by position is compared below:</w:t>
+      <w:r>
+        <w:t xml:space="preserve">The </w:t>
+      </w:r>
+      <w:r>
+        <w:t>computational efficiency metrics are compared below:</w:t>
+      </w:r>
+    </w:p>
+    <w:tbl>
+      <w:tblPr>
+        <w:tblStyle w:val="TableGrid"/>
+        <w:tblW w:w="9081" w:type="dxa"/>
+        <w:tblLook w:val="04A0" w:firstRow="1" w:lastRow="0" w:firstColumn="1" w:lastColumn="0" w:noHBand="0" w:noVBand="1"/>
+      </w:tblPr>
+      <w:tblGrid>
+        <w:gridCol w:w="3255"/>
+        <w:gridCol w:w="2410"/>
+        <w:gridCol w:w="3416"/>
+      </w:tblGrid>
+      <w:tr>
+        <w:trPr>
+          <w:trHeight w:val="381"/>
+        </w:trPr>
+        <w:tc>
+          <w:tcPr>
+            <w:tcW w:w="3255" w:type="dxa"/>
+            <w:shd w:val="clear" w:color="auto" w:fill="E7E6E6" w:themeFill="background2"/>
+            <w:vAlign w:val="center"/>
+          </w:tcPr>
+          <w:p>
+            <w:pPr>
+              <w:jc w:val="center"/>
+            </w:pPr>
+          </w:p>
+        </w:tc>
+        <w:tc>
+          <w:tcPr>
+            <w:tcW w:w="2410" w:type="dxa"/>
+            <w:shd w:val="clear" w:color="auto" w:fill="E7E6E6" w:themeFill="background2"/>
+            <w:vAlign w:val="center"/>
+          </w:tcPr>
+          <w:p>
+            <w:pPr>
+              <w:jc w:val="center"/>
+              <w:rPr>
+                <w:b/>
+                <w:bCs/>
+              </w:rPr>
+            </w:pPr>
+            <w:r>
+              <w:rPr>
+                <w:b/>
+                <w:bCs/>
+              </w:rPr>
+              <w:t xml:space="preserve">2D </w:t>
+            </w:r>
+            <w:r>
+              <w:rPr>
+                <w:b/>
+                <w:bCs/>
+              </w:rPr>
+              <w:t>Baseline</w:t>
+            </w:r>
+          </w:p>
+        </w:tc>
+        <w:tc>
+          <w:tcPr>
+            <w:tcW w:w="3416" w:type="dxa"/>
+            <w:shd w:val="clear" w:color="auto" w:fill="E7E6E6" w:themeFill="background2"/>
+            <w:vAlign w:val="center"/>
+          </w:tcPr>
+          <w:p>
+            <w:pPr>
+              <w:jc w:val="center"/>
+              <w:rPr>
+                <w:b/>
+                <w:bCs/>
+              </w:rPr>
+            </w:pPr>
+            <w:r>
+              <w:rPr>
+                <w:b/>
+                <w:bCs/>
+              </w:rPr>
+              <w:t xml:space="preserve">Improved 3D U-Net </w:t>
+            </w:r>
+            <w:r>
+              <w:rPr>
+                <w:b/>
+                <w:bCs/>
+              </w:rPr>
+              <w:t>Model</w:t>
+            </w:r>
+          </w:p>
+        </w:tc>
+      </w:tr>
+      <w:tr>
+        <w:trPr>
+          <w:trHeight w:val="381"/>
+        </w:trPr>
+        <w:tc>
+          <w:tcPr>
+            <w:tcW w:w="3255" w:type="dxa"/>
+            <w:shd w:val="clear" w:color="auto" w:fill="E7E6E6" w:themeFill="background2"/>
+            <w:vAlign w:val="center"/>
+          </w:tcPr>
+          <w:p>
+            <w:pPr>
+              <w:jc w:val="center"/>
+              <w:rPr>
+                <w:b/>
+                <w:bCs/>
+              </w:rPr>
+            </w:pPr>
+            <w:r>
+              <w:rPr>
+                <w:b/>
+                <w:bCs/>
+              </w:rPr>
+              <w:t>Training Time</w:t>
+            </w:r>
+          </w:p>
+        </w:tc>
+        <w:tc>
+          <w:tcPr>
+            <w:tcW w:w="2410" w:type="dxa"/>
+            <w:vAlign w:val="center"/>
+          </w:tcPr>
+          <w:p>
+            <w:pPr>
+              <w:jc w:val="center"/>
+            </w:pPr>
+            <w:r>
+              <w:t>17.1</w:t>
+            </w:r>
+          </w:p>
+        </w:tc>
+        <w:tc>
+          <w:tcPr>
+            <w:tcW w:w="3416" w:type="dxa"/>
+            <w:vAlign w:val="center"/>
+          </w:tcPr>
+          <w:p>
+            <w:pPr>
+              <w:jc w:val="center"/>
+            </w:pPr>
+            <w:r>
+              <w:t>22.6 min</w:t>
+            </w:r>
+          </w:p>
+        </w:tc>
+      </w:tr>
+      <w:tr>
+        <w:trPr>
+          <w:trHeight w:val="366"/>
+        </w:trPr>
+        <w:tc>
+          <w:tcPr>
+            <w:tcW w:w="3255" w:type="dxa"/>
+            <w:shd w:val="clear" w:color="auto" w:fill="E7E6E6" w:themeFill="background2"/>
+            <w:vAlign w:val="center"/>
+          </w:tcPr>
+          <w:p>
+            <w:pPr>
+              <w:jc w:val="center"/>
+              <w:rPr>
+                <w:b/>
+                <w:bCs/>
+              </w:rPr>
+            </w:pPr>
+            <w:r>
+              <w:rPr>
+                <w:b/>
+                <w:bCs/>
+              </w:rPr>
+              <w:t>Peak VRAM Training</w:t>
+            </w:r>
+          </w:p>
+        </w:tc>
+        <w:tc>
+          <w:tcPr>
+            <w:tcW w:w="2410" w:type="dxa"/>
+            <w:vAlign w:val="center"/>
+          </w:tcPr>
+          <w:p>
+            <w:pPr>
+              <w:jc w:val="center"/>
+            </w:pPr>
+            <w:r>
+              <w:t>3465 MiB</w:t>
+            </w:r>
+          </w:p>
+        </w:tc>
+        <w:tc>
+          <w:tcPr>
+            <w:tcW w:w="3416" w:type="dxa"/>
+            <w:vAlign w:val="center"/>
+          </w:tcPr>
+          <w:p>
+            <w:pPr>
+              <w:jc w:val="center"/>
+            </w:pPr>
+            <w:r>
+              <w:t>4260 MiB</w:t>
+            </w:r>
+          </w:p>
+        </w:tc>
+      </w:tr>
+      <w:tr>
+        <w:trPr>
+          <w:trHeight w:val="381"/>
+        </w:trPr>
+        <w:tc>
+          <w:tcPr>
+            <w:tcW w:w="3255" w:type="dxa"/>
+            <w:shd w:val="clear" w:color="auto" w:fill="E7E6E6" w:themeFill="background2"/>
+            <w:vAlign w:val="center"/>
+          </w:tcPr>
+          <w:p>
+            <w:pPr>
+              <w:jc w:val="center"/>
+              <w:rPr>
+                <w:b/>
+                <w:bCs/>
+              </w:rPr>
+            </w:pPr>
+            <w:r>
+              <w:rPr>
+                <w:b/>
+                <w:bCs/>
+              </w:rPr>
+              <w:t>Peak VRAM Inference</w:t>
+            </w:r>
+          </w:p>
+        </w:tc>
+        <w:tc>
+          <w:tcPr>
+            <w:tcW w:w="2410" w:type="dxa"/>
+            <w:vAlign w:val="center"/>
+          </w:tcPr>
+          <w:p>
+            <w:pPr>
+              <w:jc w:val="center"/>
+            </w:pPr>
+            <w:r>
+              <w:t>1454 MiB</w:t>
+            </w:r>
+          </w:p>
+        </w:tc>
+        <w:tc>
+          <w:tcPr>
+            <w:tcW w:w="3416" w:type="dxa"/>
+            <w:vAlign w:val="center"/>
+          </w:tcPr>
+          <w:p>
+            <w:pPr>
+              <w:jc w:val="center"/>
+            </w:pPr>
+            <w:r>
+              <w:t>1729 MiB</w:t>
+            </w:r>
+          </w:p>
+        </w:tc>
+      </w:tr>
+      <w:tr>
+        <w:trPr>
+          <w:trHeight w:val="381"/>
+        </w:trPr>
+        <w:tc>
+          <w:tcPr>
+            <w:tcW w:w="3255" w:type="dxa"/>
+            <w:shd w:val="clear" w:color="auto" w:fill="E7E6E6" w:themeFill="background2"/>
+            <w:vAlign w:val="center"/>
+          </w:tcPr>
+          <w:p>
+            <w:pPr>
+              <w:jc w:val="center"/>
+              <w:rPr>
+                <w:b/>
+                <w:bCs/>
+              </w:rPr>
+            </w:pPr>
+            <w:r>
+              <w:rPr>
+                <w:b/>
+                <w:bCs/>
+              </w:rPr>
+              <w:t>Inference Time per case</w:t>
+            </w:r>
+          </w:p>
+        </w:tc>
+        <w:tc>
+          <w:tcPr>
+            <w:tcW w:w="2410" w:type="dxa"/>
+            <w:vAlign w:val="center"/>
+          </w:tcPr>
+          <w:p>
+            <w:pPr>
+              <w:jc w:val="center"/>
+            </w:pPr>
+            <w:r>
+              <w:t>0.048 s</w:t>
+            </w:r>
+          </w:p>
+        </w:tc>
+        <w:tc>
+          <w:tcPr>
+            <w:tcW w:w="3416" w:type="dxa"/>
+            <w:vAlign w:val="center"/>
+          </w:tcPr>
+          <w:p>
+            <w:pPr>
+              <w:jc w:val="center"/>
+            </w:pPr>
+            <w:r>
+              <w:t>0.018 s</w:t>
+            </w:r>
+          </w:p>
+        </w:tc>
+      </w:tr>
+    </w:tbl>
+    <w:p/>
+    <w:p>
+      <w:r>
+        <w:t>The prostate dice by position is compared below</w:t>
+      </w:r>
+      <w:r>
+        <w:t xml:space="preserve"> in Table #. </w:t>
       </w:r>
     </w:p>
     <w:tbl>
@@ -2952,6 +3316,7 @@
                 <w:lang w:eastAsia="en-AU"/>
                 <w14:ligatures w14:val="none"/>
               </w:rPr>
+              <w:lastRenderedPageBreak/>
               <w:t>3</w:t>
             </w:r>
           </w:p>
@@ -4097,29 +4462,424 @@
     <w:p/>
     <w:p>
       <w:pPr>
-        <w:pStyle w:val="ListParagraph"/>
-        <w:numPr>
-          <w:ilvl w:val="0"/>
-          <w:numId w:val="2"/>
-        </w:numPr>
-      </w:pPr>
-      <w:r>
-        <w:t>Model results, with comparison to above</w:t>
-      </w:r>
-    </w:p>
-    <w:p>
-      <w:pPr>
-        <w:pStyle w:val="ListParagraph"/>
-        <w:numPr>
-          <w:ilvl w:val="0"/>
-          <w:numId w:val="2"/>
-        </w:numPr>
-      </w:pPr>
-      <w:r>
-        <w:t>Error cases (FP, FN), (prostate base and apex slices)</w:t>
-      </w:r>
-    </w:p>
-    <w:p/>
+        <w:rPr>
+          <w:rFonts w:eastAsia="Times New Roman" w:cs="Times New Roman"/>
+          <w:kern w:val="0"/>
+          <w:lang w:eastAsia="en-AU"/>
+          <w14:ligatures w14:val="none"/>
+        </w:rPr>
+      </w:pPr>
+      <w:r>
+        <w:t xml:space="preserve">Table # indicates </w:t>
+      </w:r>
+      <w:r>
+        <w:t xml:space="preserve">that the 3D Improved U-Net </w:t>
+      </w:r>
+      <w:r>
+        <w:t xml:space="preserve">performed better </w:t>
+      </w:r>
+      <w:r>
+        <w:t xml:space="preserve">compared to the baseline </w:t>
+      </w:r>
+      <w:r>
+        <w:t xml:space="preserve">at prostate classification at the challenging base and apex slices. </w:t>
+      </w:r>
+      <w:r>
+        <w:t xml:space="preserve">The model improved </w:t>
+      </w:r>
+      <w:r>
+        <w:t xml:space="preserve">by </w:t>
+      </w:r>
+      <w:r>
+        <w:rPr>
+          <w:rFonts w:eastAsia="Times New Roman" w:cs="Times New Roman"/>
+          <w:kern w:val="0"/>
+          <w:lang w:eastAsia="en-AU"/>
+          <w14:ligatures w14:val="none"/>
+        </w:rPr>
+        <w:t>0.173</w:t>
+      </w:r>
+      <w:r>
+        <w:rPr>
+          <w:rFonts w:eastAsia="Times New Roman" w:cs="Times New Roman"/>
+          <w:kern w:val="0"/>
+          <w:lang w:eastAsia="en-AU"/>
+          <w14:ligatures w14:val="none"/>
+        </w:rPr>
+        <w:t xml:space="preserve"> at the apex slice, and 0.285 at the base slice. A very slight reduction in performance was recorded in the remaining central slices. This improvement constitutes a significant benefit, with the 3D Improved U-NeT greatly eliminating false positive and false negative prostate classification at these hazarding boundary and slice transitions. However, the model does demonstrate some slight smoothing of the central slice</w:t>
+      </w:r>
+      <w:r>
+        <w:rPr>
+          <w:rFonts w:eastAsia="Times New Roman" w:cs="Times New Roman"/>
+          <w:kern w:val="0"/>
+          <w:lang w:eastAsia="en-AU"/>
+          <w14:ligatures w14:val="none"/>
+        </w:rPr>
+        <w:t xml:space="preserve">s. </w:t>
+      </w:r>
+    </w:p>
+    <w:p>
+      <w:pPr>
+        <w:rPr>
+          <w:rFonts w:eastAsia="Times New Roman" w:cs="Times New Roman"/>
+          <w:kern w:val="0"/>
+          <w:lang w:eastAsia="en-AU"/>
+          <w14:ligatures w14:val="none"/>
+        </w:rPr>
+      </w:pPr>
+      <w:r>
+        <w:rPr>
+          <w:rFonts w:eastAsia="Times New Roman" w:cs="Times New Roman"/>
+          <w:kern w:val="0"/>
+          <w:lang w:eastAsia="en-AU"/>
+          <w14:ligatures w14:val="none"/>
+        </w:rPr>
+        <w:t>Five of the specific boundary failure cases</w:t>
+      </w:r>
+      <w:r>
+        <w:rPr>
+          <w:rFonts w:eastAsia="Times New Roman" w:cs="Times New Roman"/>
+          <w:kern w:val="0"/>
+          <w:lang w:eastAsia="en-AU"/>
+          <w14:ligatures w14:val="none"/>
+        </w:rPr>
+        <w:t xml:space="preserve"> for the prostate can be revie</w:t>
+      </w:r>
+      <w:r>
+        <w:rPr>
+          <w:rFonts w:eastAsia="Times New Roman" w:cs="Times New Roman"/>
+          <w:kern w:val="0"/>
+          <w:lang w:eastAsia="en-AU"/>
+          <w14:ligatures w14:val="none"/>
+        </w:rPr>
+        <w:t>we</w:t>
+      </w:r>
+      <w:r>
+        <w:rPr>
+          <w:rFonts w:eastAsia="Times New Roman" w:cs="Times New Roman"/>
+          <w:kern w:val="0"/>
+          <w:lang w:eastAsia="en-AU"/>
+          <w14:ligatures w14:val="none"/>
+        </w:rPr>
+        <w:t>d in Appendix 8.2</w:t>
+      </w:r>
+      <w:r>
+        <w:rPr>
+          <w:rFonts w:eastAsia="Times New Roman" w:cs="Times New Roman"/>
+          <w:kern w:val="0"/>
+          <w:lang w:eastAsia="en-AU"/>
+          <w14:ligatures w14:val="none"/>
+        </w:rPr>
+        <w:t xml:space="preserve">. These five </w:t>
+      </w:r>
+      <w:r>
+        <w:rPr>
+          <w:rFonts w:eastAsia="Times New Roman" w:cs="Times New Roman"/>
+          <w:kern w:val="0"/>
+          <w:lang w:eastAsia="en-AU"/>
+          <w14:ligatures w14:val="none"/>
+        </w:rPr>
+        <w:t>failures</w:t>
+      </w:r>
+      <w:r>
+        <w:rPr>
+          <w:rFonts w:eastAsia="Times New Roman" w:cs="Times New Roman"/>
+          <w:kern w:val="0"/>
+          <w:lang w:eastAsia="en-AU"/>
+          <w14:ligatures w14:val="none"/>
+        </w:rPr>
+        <w:t xml:space="preserve"> are the prostate slices with the lowest dice scores across all the test scans. </w:t>
+      </w:r>
+      <w:r>
+        <w:rPr>
+          <w:rFonts w:eastAsia="Times New Roman" w:cs="Times New Roman"/>
+          <w:kern w:val="0"/>
+          <w:lang w:eastAsia="en-AU"/>
+          <w14:ligatures w14:val="none"/>
+        </w:rPr>
+        <w:t>The images</w:t>
+      </w:r>
+      <w:r>
+        <w:rPr>
+          <w:rFonts w:eastAsia="Times New Roman" w:cs="Times New Roman"/>
+          <w:kern w:val="0"/>
+          <w:lang w:eastAsia="en-AU"/>
+          <w14:ligatures w14:val="none"/>
+        </w:rPr>
+        <w:t xml:space="preserve"> </w:t>
+      </w:r>
+      <w:r>
+        <w:rPr>
+          <w:rFonts w:eastAsia="Times New Roman" w:cs="Times New Roman"/>
+          <w:kern w:val="0"/>
+          <w:lang w:eastAsia="en-AU"/>
+          <w14:ligatures w14:val="none"/>
+        </w:rPr>
+        <w:t>compar</w:t>
+      </w:r>
+      <w:r>
+        <w:rPr>
+          <w:rFonts w:eastAsia="Times New Roman" w:cs="Times New Roman"/>
+          <w:kern w:val="0"/>
+          <w:lang w:eastAsia="en-AU"/>
+          <w14:ligatures w14:val="none"/>
+        </w:rPr>
+        <w:t>e</w:t>
+      </w:r>
+      <w:r>
+        <w:rPr>
+          <w:rFonts w:eastAsia="Times New Roman" w:cs="Times New Roman"/>
+          <w:kern w:val="0"/>
+          <w:lang w:eastAsia="en-AU"/>
+          <w14:ligatures w14:val="none"/>
+        </w:rPr>
+        <w:t xml:space="preserve"> the input image, ground truth mask, predict</w:t>
+      </w:r>
+      <w:r>
+        <w:rPr>
+          <w:rFonts w:eastAsia="Times New Roman" w:cs="Times New Roman"/>
+          <w:kern w:val="0"/>
+          <w:lang w:eastAsia="en-AU"/>
+          <w14:ligatures w14:val="none"/>
+        </w:rPr>
+        <w:t>ed</w:t>
+      </w:r>
+      <w:r>
+        <w:rPr>
+          <w:rFonts w:eastAsia="Times New Roman" w:cs="Times New Roman"/>
+          <w:kern w:val="0"/>
+          <w:lang w:eastAsia="en-AU"/>
+          <w14:ligatures w14:val="none"/>
+        </w:rPr>
+        <w:t xml:space="preserve"> mask and </w:t>
+      </w:r>
+      <w:r>
+        <w:rPr>
+          <w:rFonts w:eastAsia="Times New Roman" w:cs="Times New Roman"/>
+          <w:kern w:val="0"/>
+          <w:lang w:eastAsia="en-AU"/>
+          <w14:ligatures w14:val="none"/>
+        </w:rPr>
+        <w:t>a</w:t>
+      </w:r>
+      <w:r>
+        <w:rPr>
+          <w:rFonts w:eastAsia="Times New Roman" w:cs="Times New Roman"/>
+          <w:kern w:val="0"/>
+          <w:lang w:eastAsia="en-AU"/>
+          <w14:ligatures w14:val="none"/>
+        </w:rPr>
+        <w:t>n error overlay with false positives in red and false negatives in blu</w:t>
+      </w:r>
+      <w:r>
+        <w:rPr>
+          <w:rFonts w:eastAsia="Times New Roman" w:cs="Times New Roman"/>
+          <w:kern w:val="0"/>
+          <w:lang w:eastAsia="en-AU"/>
+          <w14:ligatures w14:val="none"/>
+        </w:rPr>
+        <w:t>e</w:t>
+      </w:r>
+      <w:r>
+        <w:rPr>
+          <w:rFonts w:eastAsia="Times New Roman" w:cs="Times New Roman"/>
+          <w:kern w:val="0"/>
+          <w:lang w:eastAsia="en-AU"/>
+          <w14:ligatures w14:val="none"/>
+        </w:rPr>
+        <w:t xml:space="preserve">. </w:t>
+      </w:r>
+      <w:r>
+        <w:rPr>
+          <w:rFonts w:eastAsia="Times New Roman" w:cs="Times New Roman"/>
+          <w:kern w:val="0"/>
+          <w:lang w:eastAsia="en-AU"/>
+          <w14:ligatures w14:val="none"/>
+        </w:rPr>
+        <w:t>These</w:t>
+      </w:r>
+      <w:r>
+        <w:rPr>
+          <w:rFonts w:eastAsia="Times New Roman" w:cs="Times New Roman"/>
+          <w:kern w:val="0"/>
+          <w:lang w:eastAsia="en-AU"/>
+          <w14:ligatures w14:val="none"/>
+        </w:rPr>
+        <w:t xml:space="preserve"> </w:t>
+      </w:r>
+      <w:r>
+        <w:rPr>
+          <w:rFonts w:eastAsia="Times New Roman" w:cs="Times New Roman"/>
+          <w:kern w:val="0"/>
+          <w:lang w:eastAsia="en-AU"/>
+          <w14:ligatures w14:val="none"/>
+        </w:rPr>
+        <w:t>five</w:t>
+      </w:r>
+      <w:r>
+        <w:rPr>
+          <w:rFonts w:eastAsia="Times New Roman" w:cs="Times New Roman"/>
+          <w:kern w:val="0"/>
+          <w:lang w:eastAsia="en-AU"/>
+          <w14:ligatures w14:val="none"/>
+        </w:rPr>
+        <w:t xml:space="preserve"> worst failure causes demonstrate a consistent under contouring of the prostate </w:t>
+      </w:r>
+      <w:r>
+        <w:rPr>
+          <w:rFonts w:eastAsia="Times New Roman" w:cs="Times New Roman"/>
+          <w:kern w:val="0"/>
+          <w:lang w:eastAsia="en-AU"/>
+          <w14:ligatures w14:val="none"/>
+        </w:rPr>
+        <w:t>at the apex</w:t>
+      </w:r>
+      <w:r>
+        <w:rPr>
+          <w:rFonts w:eastAsia="Times New Roman" w:cs="Times New Roman"/>
+          <w:kern w:val="0"/>
+          <w:lang w:eastAsia="en-AU"/>
+          <w14:ligatures w14:val="none"/>
+        </w:rPr>
+        <w:t xml:space="preserve"> </w:t>
+      </w:r>
+      <w:r>
+        <w:rPr>
+          <w:rFonts w:eastAsia="Times New Roman" w:cs="Times New Roman"/>
+          <w:kern w:val="0"/>
+          <w:lang w:eastAsia="en-AU"/>
+          <w14:ligatures w14:val="none"/>
+        </w:rPr>
+        <w:t>specifically</w:t>
+      </w:r>
+      <w:r>
+        <w:rPr>
+          <w:rFonts w:eastAsia="Times New Roman" w:cs="Times New Roman"/>
+          <w:kern w:val="0"/>
+          <w:lang w:eastAsia="en-AU"/>
+          <w14:ligatures w14:val="none"/>
+        </w:rPr>
+        <w:t xml:space="preserve">. </w:t>
+      </w:r>
+      <w:r>
+        <w:rPr>
+          <w:rFonts w:eastAsia="Times New Roman" w:cs="Times New Roman"/>
+          <w:kern w:val="0"/>
+          <w:lang w:eastAsia="en-AU"/>
+          <w14:ligatures w14:val="none"/>
+        </w:rPr>
+        <w:t>All five cases were false negatives at the prostate apex. Three were consecutive slices from one patient (case 42, slices 51–53), with the remaining two from cases 41 and 40 (slices 59 and 60).</w:t>
+      </w:r>
+      <w:r>
+        <w:rPr>
+          <w:rFonts w:eastAsia="Times New Roman" w:cs="Times New Roman"/>
+          <w:kern w:val="0"/>
+          <w:lang w:eastAsia="en-AU"/>
+          <w14:ligatures w14:val="none"/>
+        </w:rPr>
+        <w:t xml:space="preserve"> </w:t>
+      </w:r>
+    </w:p>
+    <w:p>
+      <w:pPr>
+        <w:rPr>
+          <w:rFonts w:eastAsia="Times New Roman" w:cs="Times New Roman"/>
+          <w:kern w:val="0"/>
+          <w:lang w:eastAsia="en-AU"/>
+          <w14:ligatures w14:val="none"/>
+        </w:rPr>
+      </w:pPr>
+      <w:r>
+        <w:rPr>
+          <w:rFonts w:eastAsia="Times New Roman" w:cs="Times New Roman"/>
+          <w:kern w:val="0"/>
+          <w:lang w:eastAsia="en-AU"/>
+          <w14:ligatures w14:val="none"/>
+        </w:rPr>
+        <w:t xml:space="preserve">Therefore, whilst the model has demonstrated an improvement in prostate identification at these boundary failure regions, </w:t>
+      </w:r>
+      <w:r>
+        <w:rPr>
+          <w:rFonts w:eastAsia="Times New Roman" w:cs="Times New Roman"/>
+          <w:kern w:val="0"/>
+          <w:lang w:eastAsia="en-AU"/>
+          <w14:ligatures w14:val="none"/>
+        </w:rPr>
+        <w:t xml:space="preserve">the model still recorded </w:t>
+      </w:r>
+      <w:r>
+        <w:rPr>
+          <w:rFonts w:eastAsia="Times New Roman" w:cs="Times New Roman"/>
+          <w:kern w:val="0"/>
+          <w:lang w:eastAsia="en-AU"/>
+          <w14:ligatures w14:val="none"/>
+        </w:rPr>
+        <w:t xml:space="preserve">some </w:t>
+      </w:r>
+      <w:r>
+        <w:rPr>
+          <w:rFonts w:eastAsia="Times New Roman" w:cs="Times New Roman"/>
+          <w:kern w:val="0"/>
+          <w:lang w:eastAsia="en-AU"/>
+          <w14:ligatures w14:val="none"/>
+        </w:rPr>
+        <w:t xml:space="preserve">false negative identifications. </w:t>
+      </w:r>
+      <w:r>
+        <w:rPr>
+          <w:rFonts w:eastAsia="Times New Roman" w:cs="Times New Roman"/>
+          <w:kern w:val="0"/>
+          <w:lang w:eastAsia="en-AU"/>
+          <w14:ligatures w14:val="none"/>
+        </w:rPr>
+        <w:t>This indicates a reduced</w:t>
+      </w:r>
+      <w:r>
+        <w:rPr>
+          <w:rFonts w:eastAsia="Times New Roman" w:cs="Times New Roman"/>
+          <w:kern w:val="0"/>
+          <w:lang w:eastAsia="en-AU"/>
+          <w14:ligatures w14:val="none"/>
+        </w:rPr>
+        <w:t>, but still</w:t>
+      </w:r>
+      <w:r>
+        <w:rPr>
+          <w:rFonts w:eastAsia="Times New Roman" w:cs="Times New Roman"/>
+          <w:kern w:val="0"/>
+          <w:lang w:eastAsia="en-AU"/>
+          <w14:ligatures w14:val="none"/>
+        </w:rPr>
+        <w:t xml:space="preserve"> ongoing risk of </w:t>
+      </w:r>
+      <w:r>
+        <w:rPr>
+          <w:rFonts w:eastAsia="Times New Roman" w:cs="Times New Roman"/>
+          <w:kern w:val="0"/>
+          <w:lang w:eastAsia="en-AU"/>
+          <w14:ligatures w14:val="none"/>
+        </w:rPr>
+        <w:t xml:space="preserve">under contouring and therefore introduces </w:t>
+      </w:r>
+      <w:r>
+        <w:rPr>
+          <w:rFonts w:eastAsia="Times New Roman" w:cs="Times New Roman"/>
+          <w:kern w:val="0"/>
+          <w:lang w:eastAsia="en-AU"/>
+          <w14:ligatures w14:val="none"/>
+        </w:rPr>
+        <w:t xml:space="preserve">a </w:t>
+      </w:r>
+      <w:r>
+        <w:rPr>
+          <w:rFonts w:eastAsia="Times New Roman" w:cs="Times New Roman"/>
+          <w:kern w:val="0"/>
+          <w:lang w:eastAsia="en-AU"/>
+          <w14:ligatures w14:val="none"/>
+        </w:rPr>
+        <w:t xml:space="preserve">potential risk of cancer recurrence. </w:t>
+      </w:r>
+    </w:p>
     <w:p>
       <w:pPr>
         <w:pStyle w:val="Heading2"/>
@@ -4184,6 +4944,7 @@
         </w:numPr>
       </w:pPr>
       <w:r>
+        <w:lastRenderedPageBreak/>
         <w:t>Appendices</w:t>
       </w:r>
     </w:p>
@@ -4203,6 +4964,9 @@
     </w:p>
     <w:p>
       <w:r>
+        <w:rPr>
+          <w:noProof/>
+        </w:rPr>
         <w:drawing>
           <wp:inline distT="0" distB="0" distL="0" distR="0" wp14:anchorId="375C8E56" wp14:editId="13FE0991">
             <wp:extent cx="4368758" cy="5825173"/>
@@ -4259,25 +5023,7 @@
       </w:pPr>
       <w:r>
         <w:lastRenderedPageBreak/>
-        <w:t>Appendix 8.</w:t>
-      </w:r>
-      <w:r>
-        <w:t>2</w:t>
-      </w:r>
-      <w:r>
-        <w:t xml:space="preserve">: Failures Causes for </w:t>
-      </w:r>
-      <w:r>
-        <w:t>Improved</w:t>
-      </w:r>
-      <w:r>
-        <w:t xml:space="preserve"> </w:t>
-      </w:r>
-      <w:r>
-        <w:t xml:space="preserve">U-Net </w:t>
-      </w:r>
-      <w:r>
-        <w:t>Model</w:t>
+        <w:t>Appendix 8.2: Failures Causes for Improved U-Net Model</w:t>
       </w:r>
     </w:p>
     <w:p>
@@ -4286,9 +5032,9 @@
           <w:noProof/>
         </w:rPr>
         <w:drawing>
-          <wp:inline distT="0" distB="0" distL="0" distR="0" wp14:anchorId="15DF5912" wp14:editId="035DB955">
-            <wp:extent cx="3520900" cy="4694663"/>
-            <wp:effectExtent l="0" t="0" r="3810" b="0"/>
+          <wp:inline distT="0" distB="0" distL="0" distR="0" wp14:anchorId="15DF5912" wp14:editId="6AE6CD11">
+            <wp:extent cx="4600135" cy="6133682"/>
+            <wp:effectExtent l="0" t="0" r="0" b="635"/>
             <wp:docPr id="1328696386" name="Picture 7"/>
             <wp:cNvGraphicFramePr>
               <a:graphicFrameLocks xmlns:a="http://schemas.openxmlformats.org/drawingml/2006/main" noChangeAspect="1"/>
@@ -4318,7 +5064,7 @@
                   <pic:spPr bwMode="auto">
                     <a:xfrm>
                       <a:off x="0" y="0"/>
-                      <a:ext cx="3526840" cy="4702583"/>
+                      <a:ext cx="4610103" cy="6146974"/>
                     </a:xfrm>
                     <a:prstGeom prst="rect">
                       <a:avLst/>

</xml_diff>

<commit_message>
Finished report, added conclusions and recommendations
</commit_message>
<xml_diff>
--- a/recognition/UNet_HipMRI_s48028293/Report.docx
+++ b/recognition/UNet_HipMRI_s48028293/Report.docx
@@ -14,7 +14,7 @@
         <w:t xml:space="preserve">Radiotherapy </w:t>
       </w:r>
       <w:r>
-        <w:t>Contouring on HipMRI: Evaluating a 3D Improved U-Net on Against a 2D Baseline on Boundary and Slice-Transition Errors</w:t>
+        <w:t>Contouring on HipMRI: Evaluating a 3D Improved U-Net Against a 2D Baseline on Boundary and Slice-Transition Errors</w:t>
       </w:r>
     </w:p>
     <w:p>
@@ -40,25 +40,7 @@
     </w:p>
     <w:p>
       <w:r>
-        <w:t xml:space="preserve">The purpose of this </w:t>
-      </w:r>
-      <w:r>
-        <w:t xml:space="preserve">project is to </w:t>
-      </w:r>
-      <w:r>
-        <w:t xml:space="preserve">investigate </w:t>
-      </w:r>
-      <w:r>
-        <w:t xml:space="preserve">if </w:t>
-      </w:r>
-      <w:r>
-        <w:t>a 3D Improved U-Net machine learning model can eliminate hazardous boundary and slice transition errors compared to a standard 2D baseline</w:t>
-      </w:r>
-      <w:r>
-        <w:t xml:space="preserve"> in prostate radiotherapy planning</w:t>
-      </w:r>
-      <w:r>
-        <w:t>.</w:t>
+        <w:t>This project investigates whether a 3D Improved U-Net machine learning model can eliminate hazardous boundary and slice-transition errors compared with a standard 2D baseline in prostate radiotherapy planning.</w:t>
       </w:r>
       <w:r>
         <w:t xml:space="preserve"> </w:t>
@@ -374,7 +356,13 @@
         <w:t xml:space="preserve">This project also aims to </w:t>
       </w:r>
       <w:r>
-        <w:t xml:space="preserve">provide recommendation on whether the improved model provides measurable clinical benefits for the additional computational budget required.  </w:t>
+        <w:t>provide recommendation</w:t>
+      </w:r>
+      <w:r>
+        <w:t>s</w:t>
+      </w:r>
+      <w:r>
+        <w:t xml:space="preserve"> on whether the improved model provides measurable clinical benefits for the additional computational budget required.  </w:t>
       </w:r>
     </w:p>
     <w:p>
@@ -412,7 +400,7 @@
     </w:p>
     <w:p>
       <w:r>
-        <w:t xml:space="preserve">The purpose of this project is to investigate how effectively a 3D U-Net and 3D Improved U-Net eliminate hazardous boundary and slice transition errors on the HipMRI data set, compared with a standard 2D U-Net baseline. The intended users are imaging health specialists who contour the prostrate for radiotherapy planning. </w:t>
+        <w:t xml:space="preserve">The purpose of this project is to investigate how effectively a 3D U-Net and 3D Improved U-Net eliminate hazardous boundary and slice transition errors on the HipMRI dataset, compared with a standard 2D U-Net baseline. The intended users are imaging health specialists who contour the prostate for radiotherapy planning. </w:t>
       </w:r>
       <w:r>
         <w:t>The prototype proposes an anatomical contour for the specialist to review and adjust, aiming to save contouring time while delivering a high level of boundary accuracy at the prostate base and apex, where errors are most harmful.</w:t>
@@ -439,7 +427,13 @@
         </w:numPr>
       </w:pPr>
       <w:r>
-        <w:t xml:space="preserve">2D U-Net reaches prostate dice  </w:t>
+        <w:t xml:space="preserve">2D U-Net reaches prostate </w:t>
+      </w:r>
+      <w:r>
+        <w:t>D</w:t>
+      </w:r>
+      <w:r>
+        <w:t xml:space="preserve">ice  </w:t>
       </w:r>
       <m:oMath>
         <m:r>
@@ -465,7 +459,13 @@
         </w:rPr>
       </w:pPr>
       <w:r>
-        <w:t xml:space="preserve">3D U-Net and 3D Improved U-Net reaches prostate dice </w:t>
+        <w:t xml:space="preserve">3D U-Net and 3D Improved U-Net reaches prostate </w:t>
+      </w:r>
+      <w:r>
+        <w:t>D</w:t>
+      </w:r>
+      <w:r>
+        <w:t xml:space="preserve">ice </w:t>
       </w:r>
       <m:oMath>
         <m:r>
@@ -831,7 +831,13 @@
         <w:spacing w:before="240"/>
       </w:pPr>
       <w:r>
-        <w:t xml:space="preserve">Course concepts such as U-Net, convolutional layers, skip connections, residual learning and dice loss will be utilised to construct these models. Appropriate data splitting and normalisation will also be performed in alignment with course concepts. </w:t>
+        <w:t xml:space="preserve">Course concepts such as U-Net, convolutional layers, skip connections, residual learning and </w:t>
+      </w:r>
+      <w:r>
+        <w:t>D</w:t>
+      </w:r>
+      <w:r>
+        <w:t xml:space="preserve">ice loss will be utilised to construct these models. Appropriate data splitting and normalisation will also be performed in alignment with course concepts. </w:t>
       </w:r>
     </w:p>
     <w:p>
@@ -983,18 +989,44 @@
         <w:t xml:space="preserve">Prior to completing any training, the </w:t>
       </w:r>
       <w:r>
-        <w:t xml:space="preserve">2D and 3D data sets were analysed to review the existing </w:t>
+        <w:t xml:space="preserve">2D and 3D datasets were analysed to review the existing </w:t>
       </w:r>
       <w:r>
         <w:t xml:space="preserve">data format, </w:t>
       </w:r>
       <w:r>
-        <w:t xml:space="preserve">data splits, class balance and if any leakage was present. </w:t>
+        <w:t xml:space="preserve">data splits, class balance and </w:t>
+      </w:r>
+      <w:r>
+        <w:t>whether</w:t>
+      </w:r>
+      <w:r>
+        <w:t xml:space="preserve"> any leakage was present. </w:t>
       </w:r>
     </w:p>
     <w:p>
       <w:r>
         <w:t>The following information was found:</w:t>
+      </w:r>
+    </w:p>
+    <w:p>
+      <w:pPr>
+        <w:pStyle w:val="Caption"/>
+        <w:keepNext/>
+      </w:pPr>
+      <w:r>
+        <w:t xml:space="preserve">Table </w:t>
+      </w:r>
+      <w:fldSimple w:instr=" SEQ Table \* ARABIC ">
+        <w:r>
+          <w:rPr>
+            <w:noProof/>
+          </w:rPr>
+          <w:t>1</w:t>
+        </w:r>
+      </w:fldSimple>
+      <w:r>
+        <w:t>: Data processing results</w:t>
       </w:r>
     </w:p>
     <w:tbl>
@@ -1344,7 +1376,13 @@
     <w:p/>
     <w:p>
       <w:r>
-        <w:t>This information suggests that the existing train, validate, test split is acceptable for the 2D and 3D U-</w:t>
+        <w:t xml:space="preserve">This information suggests that the existing train, </w:t>
+      </w:r>
+      <w:r>
+        <w:t>validation</w:t>
+      </w:r>
+      <w:r>
+        <w:t>, test split is acceptable for the 2D and 3D U-</w:t>
       </w:r>
       <w:r>
         <w:t>N</w:t>
@@ -1377,7 +1415,13 @@
         <w:t xml:space="preserve"> training set, 5% in the validation set and 5% in the testing set. </w:t>
       </w:r>
       <w:r>
-        <w:t xml:space="preserve">Therefore, no further data splitting or patient level splitting is required. </w:t>
+        <w:t>Therefore, no further data splitting or patient</w:t>
+      </w:r>
+      <w:r>
+        <w:t>-</w:t>
+      </w:r>
+      <w:r>
+        <w:t xml:space="preserve">level splitting is required. </w:t>
       </w:r>
     </w:p>
     <w:p>
@@ -1406,7 +1450,13 @@
         </w:numPr>
       </w:pPr>
       <w:r>
-        <w:t>Match the images to their label, patent and week number</w:t>
+        <w:t>Match the images to their label, pat</w:t>
+      </w:r>
+      <w:r>
+        <w:t>i</w:t>
+      </w:r>
+      <w:r>
+        <w:t>ent and week number</w:t>
       </w:r>
     </w:p>
     <w:p>
@@ -1418,14 +1468,7 @@
         </w:numPr>
       </w:pPr>
       <w:r>
-        <w:rPr>
-          <w:b/>
-          <w:bCs/>
-        </w:rPr>
-        <w:t>Splitting:</w:t>
-      </w:r>
-      <w:r>
-        <w:t xml:space="preserve"> Split the 3d dataset in accordance with the 2D splitting</w:t>
+        <w:t>Splitting: Split the 3d dataset in accordance with the 2D splitting</w:t>
       </w:r>
       <w:r>
         <w:t xml:space="preserve">, i.e. 31/4/3 patient level split. </w:t>
@@ -1440,14 +1483,8 @@
         </w:numPr>
       </w:pPr>
       <w:r>
-        <w:rPr>
-          <w:b/>
-          <w:bCs/>
-        </w:rPr>
-        <w:t>Down sampling</w:t>
-      </w:r>
-      <w:r>
-        <w:t xml:space="preserve">: </w:t>
+        <w:lastRenderedPageBreak/>
+        <w:t xml:space="preserve">Down sampling: </w:t>
       </w:r>
       <w:r>
         <w:t>Down sample each</w:t>
@@ -1465,29 +1502,7 @@
         </w:numPr>
       </w:pPr>
       <w:r>
-        <w:rPr>
-          <w:b/>
-          <w:bCs/>
-        </w:rPr>
-        <w:lastRenderedPageBreak/>
-        <w:t xml:space="preserve">One-Hot </w:t>
-      </w:r>
-      <w:r>
-        <w:rPr>
-          <w:b/>
-          <w:bCs/>
-        </w:rPr>
-        <w:t>Encoding</w:t>
-      </w:r>
-      <w:r>
-        <w:rPr>
-          <w:b/>
-          <w:bCs/>
-        </w:rPr>
-        <w:t>:</w:t>
-      </w:r>
-      <w:r>
-        <w:t xml:space="preserve"> The labels </w:t>
+        <w:t xml:space="preserve">One-Hot Encoding: The labels </w:t>
       </w:r>
       <w:r>
         <w:t>were</w:t>
@@ -1505,14 +1520,16 @@
         </w:numPr>
       </w:pPr>
       <w:r>
-        <w:rPr>
-          <w:b/>
-          <w:bCs/>
-        </w:rPr>
         <w:t>Normalisation</w:t>
       </w:r>
       <w:r>
-        <w:t xml:space="preserve">: Each scan has been normalised such that every scan has a mean of 0 and standard deviation of 1. </w:t>
+        <w:t xml:space="preserve">: Each scan has been normalised such that every scan has a mean of 0 and </w:t>
+      </w:r>
+      <w:r>
+        <w:t>a s</w:t>
+      </w:r>
+      <w:r>
+        <w:t xml:space="preserve">tandard deviation of 1. </w:t>
       </w:r>
     </w:p>
     <w:p>
@@ -1568,7 +1585,16 @@
         <w:t xml:space="preserve"> </w:t>
       </w:r>
       <w:r>
-        <w:t>used to add its i</w:t>
+        <w:t xml:space="preserve">are </w:t>
+      </w:r>
+      <w:r>
+        <w:t xml:space="preserve">used to add </w:t>
+      </w:r>
+      <w:r>
+        <w:t>the</w:t>
+      </w:r>
+      <w:r>
+        <w:t xml:space="preserve"> i</w:t>
       </w:r>
       <w:r>
         <w:t>np</w:t>
@@ -1621,6 +1647,9 @@
       <w:r>
         <w:t xml:space="preserve"> slope of 0.01</w:t>
       </w:r>
+      <w:r>
+        <w:t>.</w:t>
+      </w:r>
     </w:p>
     <w:p>
       <w:pPr>
@@ -1633,6 +1662,9 @@
       <w:r>
         <w:t>3D dropout randomly drops whole feature channels during training to reduce overfitting to the training dataset</w:t>
       </w:r>
+      <w:r>
+        <w:t>.</w:t>
+      </w:r>
     </w:p>
     <w:p>
       <w:pPr>
@@ -1646,7 +1678,7 @@
         <w:t xml:space="preserve">Deep supervision </w:t>
       </w:r>
       <w:r>
-        <w:t xml:space="preserve">segmentation maps from three decoder levels are up sampled and summed into the final output. </w:t>
+        <w:t xml:space="preserve">segmentation maps from three decoder levels are upsampled and summed into the final output. </w:t>
       </w:r>
     </w:p>
     <w:p>
@@ -1769,7 +1801,19 @@
         <w:rPr>
           <w:rFonts w:eastAsiaTheme="minorEastAsia"/>
         </w:rPr>
-        <w:t xml:space="preserve">combining cross entropy and of multi-class Dice, with the prostate weighted three times the dicer term so the model focuses on the smallest, clinically critical class. </w:t>
+        <w:t xml:space="preserve">combining cross entropy and of multi-class Dice, with the prostate weighted three times the </w:t>
+      </w:r>
+      <w:r>
+        <w:rPr>
+          <w:rFonts w:eastAsiaTheme="minorEastAsia"/>
+        </w:rPr>
+        <w:t>Dice</w:t>
+      </w:r>
+      <w:r>
+        <w:rPr>
+          <w:rFonts w:eastAsiaTheme="minorEastAsia"/>
+        </w:rPr>
+        <w:t xml:space="preserve"> term so the model focuses on the smallest, clinically critical class. </w:t>
       </w:r>
     </w:p>
     <w:p>
@@ -1878,18 +1922,42 @@
         <w:t xml:space="preserve">. The model trained in 17.1 mins, with an average inference time of 0.048s. The training curves </w:t>
       </w:r>
       <w:r>
-        <w:t xml:space="preserve">in Figure # </w:t>
+        <w:t xml:space="preserve">in Figure </w:t>
+      </w:r>
+      <w:r>
+        <w:t>1</w:t>
+      </w:r>
+      <w:r>
+        <w:t xml:space="preserve"> </w:t>
       </w:r>
       <w:r>
         <w:t>indicate that the model</w:t>
       </w:r>
       <w:r>
-        <w:t xml:space="preserve"> training was most successful in the early epochs of training, and the validation loss stabilised at approximately 0.3 as the training curve continued to improve, suggesting possible overfitting on the training data set. However. The validation dice scores per class increased during the early epochs and then stabilised. </w:t>
-      </w:r>
-    </w:p>
-    <w:p>
-      <w:r>
-        <w:t xml:space="preserve">Figure # is the most critical measure of the models baseline performance for this investigation, with a focus on the </w:t>
+        <w:t xml:space="preserve"> training was most successful in the early epochs of training, and the validation loss stabilised at approximately 0.3 as the training curve continued to improve, suggesting possible overfitting on the training data</w:t>
+      </w:r>
+      <w:r>
+        <w:t>s</w:t>
+      </w:r>
+      <w:r>
+        <w:t xml:space="preserve">et. However. The validation </w:t>
+      </w:r>
+      <w:r>
+        <w:t>D</w:t>
+      </w:r>
+      <w:r>
+        <w:t xml:space="preserve">ice scores per class increased during the early epochs and then stabilised. </w:t>
+      </w:r>
+    </w:p>
+    <w:p>
+      <w:r>
+        <w:t xml:space="preserve">Figure </w:t>
+      </w:r>
+      <w:r>
+        <w:t>2</w:t>
+      </w:r>
+      <w:r>
+        <w:t xml:space="preserve"> is the most critical measure of the models baseline performance for this investigation, with a focus on the </w:t>
       </w:r>
       <w:r>
         <w:t>end slices located in bins 0 and 9</w:t>
@@ -1916,16 +1984,40 @@
         <w:t>where</w:t>
       </w:r>
       <w:r>
-        <w:t xml:space="preserve"> over and under contouring of the prostate can occur. </w:t>
-      </w:r>
-      <w:r>
-        <w:t>The first slice recorded a prostate dice score of 0.524</w:t>
-      </w:r>
-      <w:r>
-        <w:t xml:space="preserve">, and the last slice a prostate dice score of 0.440. </w:t>
-      </w:r>
-      <w:r>
-        <w:t xml:space="preserve">An average dice score of 0.885 was recorded for the prostate across all slices, indicating the model was </w:t>
+        <w:t xml:space="preserve"> over and under</w:t>
+      </w:r>
+      <w:r>
+        <w:t>-</w:t>
+      </w:r>
+      <w:r>
+        <w:t xml:space="preserve">contouring of the prostate can occur. </w:t>
+      </w:r>
+      <w:r>
+        <w:t xml:space="preserve">The first slice recorded a prostate </w:t>
+      </w:r>
+      <w:r>
+        <w:t>Di</w:t>
+      </w:r>
+      <w:r>
+        <w:t>ce score of 0.524</w:t>
+      </w:r>
+      <w:r>
+        <w:t xml:space="preserve">, and the last slice a prostate </w:t>
+      </w:r>
+      <w:r>
+        <w:t>D</w:t>
+      </w:r>
+      <w:r>
+        <w:t xml:space="preserve">ice score of 0.440. </w:t>
+      </w:r>
+      <w:r>
+        <w:t xml:space="preserve">An average </w:t>
+      </w:r>
+      <w:r>
+        <w:t>D</w:t>
+      </w:r>
+      <w:r>
+        <w:t xml:space="preserve">ice score of 0.885 was recorded for the prostate across all slices, indicating the model was </w:t>
       </w:r>
       <w:r>
         <w:t>poor</w:t>
@@ -1950,6 +2042,9 @@
       </w:r>
     </w:p>
     <w:p>
+      <w:pPr>
+        <w:keepNext/>
+      </w:pPr>
       <w:r>
         <w:rPr>
           <w:noProof/>
@@ -2006,14 +2101,35 @@
     </w:p>
     <w:p>
       <w:pPr>
+        <w:pStyle w:val="Caption"/>
         <w:jc w:val="center"/>
       </w:pPr>
       <w:r>
+        <w:t xml:space="preserve">Figure </w:t>
+      </w:r>
+      <w:fldSimple w:instr=" SEQ Figure \* ARABIC ">
+        <w:r>
+          <w:rPr>
+            <w:noProof/>
+          </w:rPr>
+          <w:t>1</w:t>
+        </w:r>
+      </w:fldSimple>
+      <w:r>
+        <w:t>: Baseline Loss and Validation DSC scores</w:t>
+      </w:r>
+    </w:p>
+    <w:p>
+      <w:pPr>
+        <w:keepNext/>
+        <w:jc w:val="center"/>
+      </w:pPr>
+      <w:r>
         <w:rPr>
           <w:noProof/>
         </w:rPr>
         <w:drawing>
-          <wp:inline distT="0" distB="0" distL="0" distR="0" wp14:anchorId="257C2F4A" wp14:editId="282EFDA8">
+          <wp:inline distT="0" distB="0" distL="0" distR="0" wp14:anchorId="257C2F4A" wp14:editId="2C88AA23">
             <wp:extent cx="4026537" cy="2301006"/>
             <wp:effectExtent l="0" t="0" r="0" b="4445"/>
             <wp:docPr id="562946213" name="Picture 2"/>
@@ -2063,6 +2179,26 @@
       </w:r>
     </w:p>
     <w:p>
+      <w:pPr>
+        <w:pStyle w:val="Caption"/>
+        <w:jc w:val="center"/>
+      </w:pPr>
+      <w:r>
+        <w:t xml:space="preserve">Figure </w:t>
+      </w:r>
+      <w:fldSimple w:instr=" SEQ Figure \* ARABIC ">
+        <w:r>
+          <w:rPr>
+            <w:noProof/>
+          </w:rPr>
+          <w:t>2</w:t>
+        </w:r>
+      </w:fldSimple>
+      <w:r>
+        <w:t>: Baseline Prostate Dice by Slice Position</w:t>
+      </w:r>
+    </w:p>
+    <w:p>
       <w:r>
         <w:t>In comparison, the 3D Improved</w:t>
       </w:r>
@@ -2079,25 +2215,55 @@
         <w:t>Net model produced the following results</w:t>
       </w:r>
       <w:r>
-        <w:t xml:space="preserve"> </w:t>
-      </w:r>
-      <w:r>
-        <w:t>(refer to Appendix 8.1 for failure cases).</w:t>
-      </w:r>
-      <w:r>
-        <w:t xml:space="preserve"> The model trains in 22.6 minutes, with an average inference time of 0.018 seconds. </w:t>
-      </w:r>
-      <w:r>
-        <w:t xml:space="preserve">Figure # depicts the training curves for the model, and indicate an improved performance, with the training and validation curves loss both decreasing substantially as the epochs continue. </w:t>
-      </w:r>
-      <w:r>
-        <w:t xml:space="preserve">Similarly, the validation dice scores per class during training suggest efficient training across all the different classes. </w:t>
-      </w:r>
-    </w:p>
-    <w:p>
+        <w:t xml:space="preserve"> (refer to Appendix 8.1 for failure cases). The model trains in 22.6 minutes, with an average inference time of 0.018 seconds. </w:t>
+      </w:r>
+      <w:r>
+        <w:t xml:space="preserve">Figure </w:t>
+      </w:r>
+      <w:r>
+        <w:t>3</w:t>
+      </w:r>
+      <w:r>
+        <w:t xml:space="preserve"> depicts the training curves for the model and indicate</w:t>
+      </w:r>
+      <w:r>
+        <w:t xml:space="preserve">s </w:t>
+      </w:r>
       <w:r>
         <w:lastRenderedPageBreak/>
-        <w:t xml:space="preserve"> Figure # demonstrates the prostate dice scores across each MRI slice, with an average score of </w:t>
+        <w:t>improved performance, with the training and validation</w:t>
+      </w:r>
+      <w:r>
+        <w:t xml:space="preserve"> loss</w:t>
+      </w:r>
+      <w:r>
+        <w:t xml:space="preserve"> curves both decreasing substantially as the epochs continue. </w:t>
+      </w:r>
+      <w:r>
+        <w:t xml:space="preserve">Similarly, the validation </w:t>
+      </w:r>
+      <w:r>
+        <w:t>D</w:t>
+      </w:r>
+      <w:r>
+        <w:t xml:space="preserve">ice scores per class during training suggest efficient training across all the different classes. </w:t>
+      </w:r>
+    </w:p>
+    <w:p>
+      <w:r>
+        <w:t xml:space="preserve"> Figure </w:t>
+      </w:r>
+      <w:r>
+        <w:t>4</w:t>
+      </w:r>
+      <w:r>
+        <w:t xml:space="preserve"> demonstrates the prostate </w:t>
+      </w:r>
+      <w:r>
+        <w:t>D</w:t>
+      </w:r>
+      <w:r>
+        <w:t xml:space="preserve">ice scores across each MRI slice, with an average score of </w:t>
       </w:r>
       <w:r>
         <w:t>0.</w:t>
@@ -2106,7 +2272,25 @@
         <w:t>87</w:t>
       </w:r>
       <w:r>
-        <w:t xml:space="preserve">3 recorded. The apex slice had a dice score of 0.697 and the base slice a dice score of 0.725. These scores indicate a strong improvement in model performance at the </w:t>
+        <w:t xml:space="preserve">3 recorded. The apex slice had a </w:t>
+      </w:r>
+      <w:r>
+        <w:t>D</w:t>
+      </w:r>
+      <w:r>
+        <w:t>ice score of 0.697</w:t>
+      </w:r>
+      <w:r>
+        <w:t>,</w:t>
+      </w:r>
+      <w:r>
+        <w:t xml:space="preserve"> and the base slice a </w:t>
+      </w:r>
+      <w:r>
+        <w:t>D</w:t>
+      </w:r>
+      <w:r>
+        <w:t xml:space="preserve">ice score of 0.725. These scores indicate a strong improvement in model performance at the </w:t>
       </w:r>
       <w:r>
         <w:t>superior and inferior slices</w:t>
@@ -2126,6 +2310,7 @@
     </w:p>
     <w:p>
       <w:pPr>
+        <w:keepNext/>
         <w:jc w:val="center"/>
       </w:pPr>
       <w:r>
@@ -2184,14 +2369,35 @@
     </w:p>
     <w:p>
       <w:pPr>
+        <w:pStyle w:val="Caption"/>
         <w:jc w:val="center"/>
       </w:pPr>
       <w:r>
+        <w:t xml:space="preserve">Figure </w:t>
+      </w:r>
+      <w:fldSimple w:instr=" SEQ Figure \* ARABIC ">
+        <w:r>
+          <w:rPr>
+            <w:noProof/>
+          </w:rPr>
+          <w:t>3</w:t>
+        </w:r>
+      </w:fldSimple>
+      <w:r>
+        <w:t>: Improved 3D-Unet Loss and Validation DSC scores</w:t>
+      </w:r>
+    </w:p>
+    <w:p>
+      <w:pPr>
+        <w:keepNext/>
+        <w:jc w:val="center"/>
+      </w:pPr>
+      <w:r>
         <w:rPr>
           <w:noProof/>
         </w:rPr>
         <w:drawing>
-          <wp:inline distT="0" distB="0" distL="0" distR="0" wp14:anchorId="48E4354E" wp14:editId="75DDCB9F">
+          <wp:inline distT="0" distB="0" distL="0" distR="0" wp14:anchorId="48E4354E" wp14:editId="785D40B7">
             <wp:extent cx="4033831" cy="2305174"/>
             <wp:effectExtent l="0" t="0" r="5080" b="0"/>
             <wp:docPr id="846199533" name="Picture 8"/>
@@ -2241,11 +2447,84 @@
       </w:r>
     </w:p>
     <w:p>
+      <w:pPr>
+        <w:pStyle w:val="Caption"/>
+        <w:jc w:val="center"/>
+      </w:pPr>
+      <w:r>
+        <w:t xml:space="preserve">Figure </w:t>
+      </w:r>
+      <w:fldSimple w:instr=" SEQ Figure \* ARABIC ">
+        <w:r>
+          <w:rPr>
+            <w:noProof/>
+          </w:rPr>
+          <w:t>4</w:t>
+        </w:r>
+      </w:fldSimple>
+      <w:r>
+        <w:t>:</w:t>
+      </w:r>
+      <w:r>
+        <w:t xml:space="preserve"> </w:t>
+      </w:r>
+      <w:r>
+        <w:t>Improved 3D-Inet</w:t>
+      </w:r>
+      <w:r>
+        <w:t xml:space="preserve"> Prostate Dice by Slice Position</w:t>
+      </w:r>
+    </w:p>
+    <w:p>
       <w:r>
         <w:t xml:space="preserve">The </w:t>
       </w:r>
       <w:r>
-        <w:t>computational efficiency metrics are compared below:</w:t>
+        <w:t>computational efficiency metrics are compared below</w:t>
+      </w:r>
+      <w:r>
+        <w:t xml:space="preserve"> in Table </w:t>
+      </w:r>
+      <w:r>
+        <w:t>2</w:t>
+      </w:r>
+      <w:r>
+        <w:t xml:space="preserve">. They </w:t>
+      </w:r>
+      <w:r>
+        <w:t xml:space="preserve">indicate that the improved model </w:t>
+      </w:r>
+      <w:r>
+        <w:t xml:space="preserve">has a higher computational cost, requiring more training time and more peak VRAM. </w:t>
+      </w:r>
+      <w:r>
+        <w:t xml:space="preserve">However, this increase in computational cost is expected, given </w:t>
+      </w:r>
+      <w:r>
+        <w:t xml:space="preserve">that </w:t>
+      </w:r>
+      <w:r>
+        <w:t xml:space="preserve">the improved model performs 3D convolutions, with substantially more activations stored per forward pass. </w:t>
+      </w:r>
+    </w:p>
+    <w:p>
+      <w:pPr>
+        <w:pStyle w:val="Caption"/>
+        <w:keepNext/>
+      </w:pPr>
+      <w:r>
+        <w:t xml:space="preserve">Table </w:t>
+      </w:r>
+      <w:fldSimple w:instr=" SEQ Table \* ARABIC ">
+        <w:r>
+          <w:rPr>
+            <w:noProof/>
+          </w:rPr>
+          <w:t>2</w:t>
+        </w:r>
+      </w:fldSimple>
+      <w:r>
+        <w:t>: Computational Metric Comparison</w:t>
       </w:r>
     </w:p>
     <w:tbl>
@@ -2375,6 +2654,9 @@
             <w:r>
               <w:t>17.1</w:t>
             </w:r>
+            <w:r>
+              <w:t xml:space="preserve"> min</w:t>
+            </w:r>
           </w:p>
         </w:tc>
         <w:tc>
@@ -2471,6 +2753,7 @@
                 <w:b/>
                 <w:bCs/>
               </w:rPr>
+              <w:lastRenderedPageBreak/>
               <w:t>Peak VRAM Inference</w:t>
             </w:r>
           </w:p>
@@ -2564,25 +2847,57 @@
     <w:p/>
     <w:p>
       <w:r>
-        <w:t>The prostate dice by position is compared below</w:t>
-      </w:r>
-      <w:r>
-        <w:t xml:space="preserve"> in Table #. </w:t>
+        <w:t xml:space="preserve">The prostate </w:t>
+      </w:r>
+      <w:r>
+        <w:t>D</w:t>
+      </w:r>
+      <w:r>
+        <w:t>ice by position is compared below</w:t>
+      </w:r>
+      <w:r>
+        <w:t xml:space="preserve"> in Table </w:t>
+      </w:r>
+      <w:r>
+        <w:t>3</w:t>
+      </w:r>
+      <w:r>
+        <w:t xml:space="preserve">. </w:t>
+      </w:r>
+    </w:p>
+    <w:p>
+      <w:pPr>
+        <w:pStyle w:val="Caption"/>
+        <w:keepNext/>
+      </w:pPr>
+      <w:r>
+        <w:t xml:space="preserve">Table </w:t>
+      </w:r>
+      <w:fldSimple w:instr=" SEQ Table \* ARABIC ">
+        <w:r>
+          <w:rPr>
+            <w:noProof/>
+          </w:rPr>
+          <w:t>3</w:t>
+        </w:r>
+      </w:fldSimple>
+      <w:r>
+        <w:t>: DSC Scores compared by slice position</w:t>
       </w:r>
     </w:p>
     <w:tbl>
       <w:tblPr>
         <w:tblStyle w:val="TableGrid"/>
-        <w:tblW w:w="9391" w:type="dxa"/>
+        <w:tblW w:w="9399" w:type="dxa"/>
         <w:tblLook w:val="04A0" w:firstRow="1" w:lastRow="0" w:firstColumn="1" w:lastColumn="0" w:noHBand="0" w:noVBand="1"/>
       </w:tblPr>
       <w:tblGrid>
-        <w:gridCol w:w="795"/>
+        <w:gridCol w:w="803"/>
         <w:gridCol w:w="1470"/>
         <w:gridCol w:w="1591"/>
-        <w:gridCol w:w="1591"/>
-        <w:gridCol w:w="2097"/>
-        <w:gridCol w:w="1847"/>
+        <w:gridCol w:w="1943"/>
+        <w:gridCol w:w="2268"/>
+        <w:gridCol w:w="1324"/>
       </w:tblGrid>
       <w:tr>
         <w:trPr>
@@ -2590,7 +2905,7 @@
         </w:trPr>
         <w:tc>
           <w:tcPr>
-            <w:tcW w:w="795" w:type="dxa"/>
+            <w:tcW w:w="803" w:type="dxa"/>
             <w:hideMark/>
           </w:tcPr>
           <w:p>
@@ -2702,7 +3017,7 @@
         </w:tc>
         <w:tc>
           <w:tcPr>
-            <w:tcW w:w="1591" w:type="dxa"/>
+            <w:tcW w:w="1943" w:type="dxa"/>
             <w:hideMark/>
           </w:tcPr>
           <w:p>
@@ -2732,7 +3047,7 @@
         </w:tc>
         <w:tc>
           <w:tcPr>
-            <w:tcW w:w="2097" w:type="dxa"/>
+            <w:tcW w:w="2268" w:type="dxa"/>
             <w:hideMark/>
           </w:tcPr>
           <w:p>
@@ -2762,7 +3077,7 @@
         </w:tc>
         <w:tc>
           <w:tcPr>
-            <w:tcW w:w="1847" w:type="dxa"/>
+            <w:tcW w:w="1324" w:type="dxa"/>
             <w:hideMark/>
           </w:tcPr>
           <w:p>
@@ -2797,7 +3112,7 @@
         </w:trPr>
         <w:tc>
           <w:tcPr>
-            <w:tcW w:w="795" w:type="dxa"/>
+            <w:tcW w:w="803" w:type="dxa"/>
             <w:noWrap/>
             <w:hideMark/>
           </w:tcPr>
@@ -2880,7 +3195,7 @@
         </w:tc>
         <w:tc>
           <w:tcPr>
-            <w:tcW w:w="1591" w:type="dxa"/>
+            <w:tcW w:w="1943" w:type="dxa"/>
             <w:noWrap/>
             <w:hideMark/>
           </w:tcPr>
@@ -2909,7 +3224,7 @@
         </w:tc>
         <w:tc>
           <w:tcPr>
-            <w:tcW w:w="2097" w:type="dxa"/>
+            <w:tcW w:w="2268" w:type="dxa"/>
             <w:shd w:val="clear" w:color="auto" w:fill="E2EFD9" w:themeFill="accent6" w:themeFillTint="33"/>
             <w:noWrap/>
             <w:hideMark/>
@@ -2937,7 +3252,7 @@
         </w:tc>
         <w:tc>
           <w:tcPr>
-            <w:tcW w:w="1847" w:type="dxa"/>
+            <w:tcW w:w="1324" w:type="dxa"/>
             <w:noWrap/>
             <w:hideMark/>
           </w:tcPr>
@@ -2969,7 +3284,7 @@
         </w:trPr>
         <w:tc>
           <w:tcPr>
-            <w:tcW w:w="795" w:type="dxa"/>
+            <w:tcW w:w="803" w:type="dxa"/>
             <w:noWrap/>
             <w:hideMark/>
           </w:tcPr>
@@ -3052,7 +3367,7 @@
         </w:tc>
         <w:tc>
           <w:tcPr>
-            <w:tcW w:w="1591" w:type="dxa"/>
+            <w:tcW w:w="1943" w:type="dxa"/>
             <w:noWrap/>
             <w:hideMark/>
           </w:tcPr>
@@ -3081,7 +3396,7 @@
         </w:tc>
         <w:tc>
           <w:tcPr>
-            <w:tcW w:w="2097" w:type="dxa"/>
+            <w:tcW w:w="2268" w:type="dxa"/>
             <w:shd w:val="clear" w:color="auto" w:fill="FCD1CC"/>
             <w:noWrap/>
             <w:hideMark/>
@@ -3109,7 +3424,7 @@
         </w:tc>
         <w:tc>
           <w:tcPr>
-            <w:tcW w:w="1847" w:type="dxa"/>
+            <w:tcW w:w="1324" w:type="dxa"/>
             <w:noWrap/>
             <w:hideMark/>
           </w:tcPr>
@@ -3132,7 +3447,7 @@
         </w:trPr>
         <w:tc>
           <w:tcPr>
-            <w:tcW w:w="795" w:type="dxa"/>
+            <w:tcW w:w="803" w:type="dxa"/>
             <w:noWrap/>
             <w:hideMark/>
           </w:tcPr>
@@ -3215,7 +3530,7 @@
         </w:tc>
         <w:tc>
           <w:tcPr>
-            <w:tcW w:w="1591" w:type="dxa"/>
+            <w:tcW w:w="1943" w:type="dxa"/>
             <w:noWrap/>
             <w:hideMark/>
           </w:tcPr>
@@ -3244,7 +3559,7 @@
         </w:tc>
         <w:tc>
           <w:tcPr>
-            <w:tcW w:w="2097" w:type="dxa"/>
+            <w:tcW w:w="2268" w:type="dxa"/>
             <w:shd w:val="clear" w:color="auto" w:fill="FCD1CC"/>
             <w:noWrap/>
             <w:hideMark/>
@@ -3272,7 +3587,7 @@
         </w:tc>
         <w:tc>
           <w:tcPr>
-            <w:tcW w:w="1847" w:type="dxa"/>
+            <w:tcW w:w="1324" w:type="dxa"/>
             <w:noWrap/>
             <w:hideMark/>
           </w:tcPr>
@@ -3295,7 +3610,7 @@
         </w:trPr>
         <w:tc>
           <w:tcPr>
-            <w:tcW w:w="795" w:type="dxa"/>
+            <w:tcW w:w="803" w:type="dxa"/>
             <w:noWrap/>
             <w:hideMark/>
           </w:tcPr>
@@ -3316,7 +3631,6 @@
                 <w:lang w:eastAsia="en-AU"/>
                 <w14:ligatures w14:val="none"/>
               </w:rPr>
-              <w:lastRenderedPageBreak/>
               <w:t>3</w:t>
             </w:r>
           </w:p>
@@ -3379,7 +3693,7 @@
         </w:tc>
         <w:tc>
           <w:tcPr>
-            <w:tcW w:w="1591" w:type="dxa"/>
+            <w:tcW w:w="1943" w:type="dxa"/>
             <w:noWrap/>
             <w:hideMark/>
           </w:tcPr>
@@ -3408,7 +3722,7 @@
         </w:tc>
         <w:tc>
           <w:tcPr>
-            <w:tcW w:w="2097" w:type="dxa"/>
+            <w:tcW w:w="2268" w:type="dxa"/>
             <w:shd w:val="clear" w:color="auto" w:fill="FCD1CC"/>
             <w:noWrap/>
             <w:hideMark/>
@@ -3436,7 +3750,7 @@
         </w:tc>
         <w:tc>
           <w:tcPr>
-            <w:tcW w:w="1847" w:type="dxa"/>
+            <w:tcW w:w="1324" w:type="dxa"/>
             <w:noWrap/>
             <w:hideMark/>
           </w:tcPr>
@@ -3459,7 +3773,7 @@
         </w:trPr>
         <w:tc>
           <w:tcPr>
-            <w:tcW w:w="795" w:type="dxa"/>
+            <w:tcW w:w="803" w:type="dxa"/>
             <w:noWrap/>
             <w:hideMark/>
           </w:tcPr>
@@ -3542,7 +3856,7 @@
         </w:tc>
         <w:tc>
           <w:tcPr>
-            <w:tcW w:w="1591" w:type="dxa"/>
+            <w:tcW w:w="1943" w:type="dxa"/>
             <w:noWrap/>
             <w:hideMark/>
           </w:tcPr>
@@ -3571,7 +3885,7 @@
         </w:tc>
         <w:tc>
           <w:tcPr>
-            <w:tcW w:w="2097" w:type="dxa"/>
+            <w:tcW w:w="2268" w:type="dxa"/>
             <w:shd w:val="clear" w:color="auto" w:fill="FCD1CC"/>
             <w:noWrap/>
             <w:hideMark/>
@@ -3599,7 +3913,7 @@
         </w:tc>
         <w:tc>
           <w:tcPr>
-            <w:tcW w:w="1847" w:type="dxa"/>
+            <w:tcW w:w="1324" w:type="dxa"/>
             <w:noWrap/>
             <w:hideMark/>
           </w:tcPr>
@@ -3631,7 +3945,7 @@
         </w:trPr>
         <w:tc>
           <w:tcPr>
-            <w:tcW w:w="795" w:type="dxa"/>
+            <w:tcW w:w="803" w:type="dxa"/>
             <w:noWrap/>
             <w:hideMark/>
           </w:tcPr>
@@ -3714,7 +4028,7 @@
         </w:tc>
         <w:tc>
           <w:tcPr>
-            <w:tcW w:w="1591" w:type="dxa"/>
+            <w:tcW w:w="1943" w:type="dxa"/>
             <w:noWrap/>
             <w:hideMark/>
           </w:tcPr>
@@ -3743,7 +4057,7 @@
         </w:tc>
         <w:tc>
           <w:tcPr>
-            <w:tcW w:w="2097" w:type="dxa"/>
+            <w:tcW w:w="2268" w:type="dxa"/>
             <w:shd w:val="clear" w:color="auto" w:fill="FCD1CC"/>
             <w:noWrap/>
             <w:hideMark/>
@@ -3771,7 +4085,7 @@
         </w:tc>
         <w:tc>
           <w:tcPr>
-            <w:tcW w:w="1847" w:type="dxa"/>
+            <w:tcW w:w="1324" w:type="dxa"/>
             <w:noWrap/>
             <w:hideMark/>
           </w:tcPr>
@@ -3803,7 +4117,7 @@
         </w:trPr>
         <w:tc>
           <w:tcPr>
-            <w:tcW w:w="795" w:type="dxa"/>
+            <w:tcW w:w="803" w:type="dxa"/>
             <w:noWrap/>
             <w:hideMark/>
           </w:tcPr>
@@ -3886,7 +4200,7 @@
         </w:tc>
         <w:tc>
           <w:tcPr>
-            <w:tcW w:w="1591" w:type="dxa"/>
+            <w:tcW w:w="1943" w:type="dxa"/>
             <w:noWrap/>
             <w:hideMark/>
           </w:tcPr>
@@ -3915,7 +4229,7 @@
         </w:tc>
         <w:tc>
           <w:tcPr>
-            <w:tcW w:w="2097" w:type="dxa"/>
+            <w:tcW w:w="2268" w:type="dxa"/>
             <w:shd w:val="clear" w:color="auto" w:fill="FCD1CC"/>
             <w:noWrap/>
             <w:hideMark/>
@@ -3943,7 +4257,7 @@
         </w:tc>
         <w:tc>
           <w:tcPr>
-            <w:tcW w:w="1847" w:type="dxa"/>
+            <w:tcW w:w="1324" w:type="dxa"/>
             <w:noWrap/>
             <w:hideMark/>
           </w:tcPr>
@@ -3966,7 +4280,7 @@
         </w:trPr>
         <w:tc>
           <w:tcPr>
-            <w:tcW w:w="795" w:type="dxa"/>
+            <w:tcW w:w="803" w:type="dxa"/>
             <w:noWrap/>
             <w:hideMark/>
           </w:tcPr>
@@ -4049,7 +4363,7 @@
         </w:tc>
         <w:tc>
           <w:tcPr>
-            <w:tcW w:w="1591" w:type="dxa"/>
+            <w:tcW w:w="1943" w:type="dxa"/>
             <w:noWrap/>
             <w:hideMark/>
           </w:tcPr>
@@ -4078,7 +4392,7 @@
         </w:tc>
         <w:tc>
           <w:tcPr>
-            <w:tcW w:w="2097" w:type="dxa"/>
+            <w:tcW w:w="2268" w:type="dxa"/>
             <w:shd w:val="clear" w:color="auto" w:fill="FCD1CC"/>
             <w:noWrap/>
             <w:hideMark/>
@@ -4106,7 +4420,7 @@
         </w:tc>
         <w:tc>
           <w:tcPr>
-            <w:tcW w:w="1847" w:type="dxa"/>
+            <w:tcW w:w="1324" w:type="dxa"/>
             <w:noWrap/>
             <w:hideMark/>
           </w:tcPr>
@@ -4129,7 +4443,7 @@
         </w:trPr>
         <w:tc>
           <w:tcPr>
-            <w:tcW w:w="795" w:type="dxa"/>
+            <w:tcW w:w="803" w:type="dxa"/>
             <w:noWrap/>
             <w:hideMark/>
           </w:tcPr>
@@ -4212,7 +4526,7 @@
         </w:tc>
         <w:tc>
           <w:tcPr>
-            <w:tcW w:w="1591" w:type="dxa"/>
+            <w:tcW w:w="1943" w:type="dxa"/>
             <w:noWrap/>
             <w:hideMark/>
           </w:tcPr>
@@ -4241,7 +4555,7 @@
         </w:tc>
         <w:tc>
           <w:tcPr>
-            <w:tcW w:w="2097" w:type="dxa"/>
+            <w:tcW w:w="2268" w:type="dxa"/>
             <w:shd w:val="clear" w:color="auto" w:fill="E2EFD9" w:themeFill="accent6" w:themeFillTint="33"/>
             <w:noWrap/>
             <w:hideMark/>
@@ -4269,7 +4583,7 @@
         </w:tc>
         <w:tc>
           <w:tcPr>
-            <w:tcW w:w="1847" w:type="dxa"/>
+            <w:tcW w:w="1324" w:type="dxa"/>
             <w:noWrap/>
             <w:hideMark/>
           </w:tcPr>
@@ -4292,7 +4606,7 @@
         </w:trPr>
         <w:tc>
           <w:tcPr>
-            <w:tcW w:w="795" w:type="dxa"/>
+            <w:tcW w:w="803" w:type="dxa"/>
             <w:noWrap/>
             <w:hideMark/>
           </w:tcPr>
@@ -4375,7 +4689,7 @@
         </w:tc>
         <w:tc>
           <w:tcPr>
-            <w:tcW w:w="1591" w:type="dxa"/>
+            <w:tcW w:w="1943" w:type="dxa"/>
             <w:noWrap/>
             <w:hideMark/>
           </w:tcPr>
@@ -4404,7 +4718,7 @@
         </w:tc>
         <w:tc>
           <w:tcPr>
-            <w:tcW w:w="2097" w:type="dxa"/>
+            <w:tcW w:w="2268" w:type="dxa"/>
             <w:shd w:val="clear" w:color="auto" w:fill="E2EFD9" w:themeFill="accent6" w:themeFillTint="33"/>
             <w:noWrap/>
             <w:hideMark/>
@@ -4432,7 +4746,7 @@
         </w:tc>
         <w:tc>
           <w:tcPr>
-            <w:tcW w:w="1847" w:type="dxa"/>
+            <w:tcW w:w="1324" w:type="dxa"/>
             <w:noWrap/>
             <w:hideMark/>
           </w:tcPr>
@@ -4455,6 +4769,164 @@
               </w:rPr>
               <w:t>Base end</w:t>
             </w:r>
+          </w:p>
+        </w:tc>
+      </w:tr>
+      <w:tr>
+        <w:trPr>
+          <w:trHeight w:val="305"/>
+        </w:trPr>
+        <w:tc>
+          <w:tcPr>
+            <w:tcW w:w="2273" w:type="dxa"/>
+            <w:gridSpan w:val="2"/>
+            <w:noWrap/>
+          </w:tcPr>
+          <w:p>
+            <w:pPr>
+              <w:jc w:val="center"/>
+              <w:rPr>
+                <w:rFonts w:eastAsia="Times New Roman" w:cs="Times New Roman"/>
+                <w:b/>
+                <w:bCs/>
+                <w:kern w:val="0"/>
+                <w:lang w:eastAsia="en-AU"/>
+                <w14:ligatures w14:val="none"/>
+              </w:rPr>
+            </w:pPr>
+            <w:r>
+              <w:rPr>
+                <w:rFonts w:eastAsia="Times New Roman" w:cs="Times New Roman"/>
+                <w:b/>
+                <w:bCs/>
+                <w:kern w:val="0"/>
+                <w:lang w:eastAsia="en-AU"/>
+                <w14:ligatures w14:val="none"/>
+              </w:rPr>
+              <w:t>Mean</w:t>
+            </w:r>
+          </w:p>
+        </w:tc>
+        <w:tc>
+          <w:tcPr>
+            <w:tcW w:w="1591" w:type="dxa"/>
+            <w:noWrap/>
+          </w:tcPr>
+          <w:p>
+            <w:pPr>
+              <w:jc w:val="center"/>
+              <w:rPr>
+                <w:rFonts w:eastAsia="Times New Roman" w:cs="Times New Roman"/>
+                <w:color w:val="000000" w:themeColor="text1"/>
+                <w:kern w:val="0"/>
+                <w:lang w:eastAsia="en-AU"/>
+                <w14:ligatures w14:val="none"/>
+              </w:rPr>
+            </w:pPr>
+            <w:r>
+              <w:rPr>
+                <w:rFonts w:eastAsia="Times New Roman" w:cs="Times New Roman"/>
+                <w:color w:val="000000" w:themeColor="text1"/>
+                <w:kern w:val="0"/>
+                <w:lang w:eastAsia="en-AU"/>
+                <w14:ligatures w14:val="none"/>
+              </w:rPr>
+              <w:t>0.885</w:t>
+            </w:r>
+          </w:p>
+        </w:tc>
+        <w:tc>
+          <w:tcPr>
+            <w:tcW w:w="1943" w:type="dxa"/>
+            <w:noWrap/>
+          </w:tcPr>
+          <w:p>
+            <w:pPr>
+              <w:jc w:val="center"/>
+              <w:rPr>
+                <w:rFonts w:eastAsia="Times New Roman" w:cs="Times New Roman"/>
+                <w:color w:val="000000" w:themeColor="text1"/>
+                <w:kern w:val="0"/>
+                <w:lang w:eastAsia="en-AU"/>
+                <w14:ligatures w14:val="none"/>
+              </w:rPr>
+            </w:pPr>
+            <w:r>
+              <w:rPr>
+                <w:rFonts w:eastAsia="Times New Roman" w:cs="Times New Roman"/>
+                <w:color w:val="000000" w:themeColor="text1"/>
+                <w:kern w:val="0"/>
+                <w:lang w:eastAsia="en-AU"/>
+                <w14:ligatures w14:val="none"/>
+              </w:rPr>
+              <w:t>0.873</w:t>
+            </w:r>
+          </w:p>
+        </w:tc>
+        <w:tc>
+          <w:tcPr>
+            <w:tcW w:w="2268" w:type="dxa"/>
+            <w:shd w:val="clear" w:color="auto" w:fill="E2EFD9" w:themeFill="accent6" w:themeFillTint="33"/>
+            <w:noWrap/>
+          </w:tcPr>
+          <w:p>
+            <w:pPr>
+              <w:jc w:val="center"/>
+              <w:rPr>
+                <w:rFonts w:eastAsia="Times New Roman" w:cs="Times New Roman"/>
+                <w:b/>
+                <w:bCs/>
+                <w:kern w:val="0"/>
+                <w:lang w:eastAsia="en-AU"/>
+                <w14:ligatures w14:val="none"/>
+              </w:rPr>
+            </w:pPr>
+            <w:r>
+              <w:rPr>
+                <w:rFonts w:eastAsia="Times New Roman" w:cs="Times New Roman"/>
+                <w:kern w:val="0"/>
+                <w:lang w:eastAsia="en-AU"/>
+                <w14:ligatures w14:val="none"/>
+              </w:rPr>
+              <w:t>-</w:t>
+            </w:r>
+            <w:r>
+              <w:rPr>
+                <w:rFonts w:eastAsia="Times New Roman" w:cs="Times New Roman"/>
+                <w:kern w:val="0"/>
+                <w:lang w:eastAsia="en-AU"/>
+                <w14:ligatures w14:val="none"/>
+              </w:rPr>
+              <w:t>0.</w:t>
+            </w:r>
+            <w:r>
+              <w:rPr>
+                <w:rFonts w:eastAsia="Times New Roman" w:cs="Times New Roman"/>
+                <w:kern w:val="0"/>
+                <w:lang w:eastAsia="en-AU"/>
+                <w14:ligatures w14:val="none"/>
+              </w:rPr>
+              <w:t>012</w:t>
+            </w:r>
+          </w:p>
+        </w:tc>
+        <w:tc>
+          <w:tcPr>
+            <w:tcW w:w="1324" w:type="dxa"/>
+            <w:noWrap/>
+          </w:tcPr>
+          <w:p>
+            <w:pPr>
+              <w:jc w:val="center"/>
+              <w:rPr>
+                <w:rFonts w:eastAsia="Times New Roman" w:cs="Times New Roman"/>
+                <w:b/>
+                <w:bCs/>
+                <w:kern w:val="0"/>
+                <w:lang w:eastAsia="en-AU"/>
+                <w14:ligatures w14:val="none"/>
+              </w:rPr>
+            </w:pPr>
           </w:p>
         </w:tc>
       </w:tr>
@@ -4470,7 +4942,13 @@
         </w:rPr>
       </w:pPr>
       <w:r>
-        <w:t xml:space="preserve">Table # indicates </w:t>
+        <w:t xml:space="preserve">Table </w:t>
+      </w:r>
+      <w:r>
+        <w:t>3</w:t>
+      </w:r>
+      <w:r>
+        <w:t xml:space="preserve"> indicates </w:t>
       </w:r>
       <w:r>
         <w:t xml:space="preserve">that the 3D Improved U-Net </w:t>
@@ -4485,10 +4963,19 @@
         <w:t xml:space="preserve">at prostate classification at the challenging base and apex slices. </w:t>
       </w:r>
       <w:r>
-        <w:t xml:space="preserve">The model improved </w:t>
-      </w:r>
-      <w:r>
-        <w:t xml:space="preserve">by </w:t>
+        <w:t xml:space="preserve">The model </w:t>
+      </w:r>
+      <w:r>
+        <w:t>recorded an improved</w:t>
+      </w:r>
+      <w:r>
+        <w:t xml:space="preserve"> </w:t>
+      </w:r>
+      <w:r>
+        <w:t>average performance of</w:t>
+      </w:r>
+      <w:r>
+        <w:t xml:space="preserve"> </w:t>
       </w:r>
       <w:r>
         <w:rPr>
@@ -4506,7 +4993,7 @@
           <w:lang w:eastAsia="en-AU"/>
           <w14:ligatures w14:val="none"/>
         </w:rPr>
-        <w:t xml:space="preserve"> at the apex slice, and 0.285 at the base slice. A very slight reduction in performance was recorded in the remaining central slices. This improvement constitutes a significant benefit, with the 3D Improved U-NeT greatly eliminating false positive and false negative prostate classification at these hazarding boundary and slice transitions. However, the model does demonstrate some slight smoothing of the central slice</w:t>
+        <w:t xml:space="preserve"> at the apex slice and 0.285 at the base. A very slight reduction in performance was recorded in the remaining central slices. This improvement constitutes a significant benefit, with the 3D Improved U-Ne</w:t>
       </w:r>
       <w:r>
         <w:rPr>
@@ -4515,18 +5002,17 @@
           <w:lang w:eastAsia="en-AU"/>
           <w14:ligatures w14:val="none"/>
         </w:rPr>
-        <w:t xml:space="preserve">s. </w:t>
-      </w:r>
-    </w:p>
-    <w:p>
-      <w:pPr>
+        <w:t>t</w:t>
+      </w:r>
+      <w:r>
         <w:rPr>
           <w:rFonts w:eastAsia="Times New Roman" w:cs="Times New Roman"/>
           <w:kern w:val="0"/>
           <w:lang w:eastAsia="en-AU"/>
           <w14:ligatures w14:val="none"/>
         </w:rPr>
-      </w:pPr>
+        <w:t xml:space="preserve"> greatly eliminating false positive and false negative prostate classification at these hazarding boundary and slice transitions. However, the model does demonstrate some slight smoothing of the central slice</w:t>
+      </w:r>
       <w:r>
         <w:rPr>
           <w:rFonts w:eastAsia="Times New Roman" w:cs="Times New Roman"/>
@@ -4534,17 +5020,18 @@
           <w:lang w:eastAsia="en-AU"/>
           <w14:ligatures w14:val="none"/>
         </w:rPr>
-        <w:t>Five of the specific boundary failure cases</w:t>
-      </w:r>
-      <w:r>
+        <w:t xml:space="preserve">s. </w:t>
+      </w:r>
+    </w:p>
+    <w:p>
+      <w:pPr>
         <w:rPr>
           <w:rFonts w:eastAsia="Times New Roman" w:cs="Times New Roman"/>
           <w:kern w:val="0"/>
           <w:lang w:eastAsia="en-AU"/>
           <w14:ligatures w14:val="none"/>
         </w:rPr>
-        <w:t xml:space="preserve"> for the prostate can be revie</w:t>
-      </w:r>
+      </w:pPr>
       <w:r>
         <w:rPr>
           <w:rFonts w:eastAsia="Times New Roman" w:cs="Times New Roman"/>
@@ -4552,7 +5039,7 @@
           <w:lang w:eastAsia="en-AU"/>
           <w14:ligatures w14:val="none"/>
         </w:rPr>
-        <w:t>we</w:t>
+        <w:t>Five of the specific boundary failure cases</w:t>
       </w:r>
       <w:r>
         <w:rPr>
@@ -4561,7 +5048,7 @@
           <w:lang w:eastAsia="en-AU"/>
           <w14:ligatures w14:val="none"/>
         </w:rPr>
-        <w:t>d in Appendix 8.2</w:t>
+        <w:t xml:space="preserve"> for the prostate can be revie</w:t>
       </w:r>
       <w:r>
         <w:rPr>
@@ -4570,7 +5057,7 @@
           <w:lang w:eastAsia="en-AU"/>
           <w14:ligatures w14:val="none"/>
         </w:rPr>
-        <w:t xml:space="preserve">. These five </w:t>
+        <w:t>we</w:t>
       </w:r>
       <w:r>
         <w:rPr>
@@ -4579,7 +5066,7 @@
           <w:lang w:eastAsia="en-AU"/>
           <w14:ligatures w14:val="none"/>
         </w:rPr>
-        <w:t>failures</w:t>
+        <w:t>d in Appendix 8.2</w:t>
       </w:r>
       <w:r>
         <w:rPr>
@@ -4588,7 +5075,7 @@
           <w:lang w:eastAsia="en-AU"/>
           <w14:ligatures w14:val="none"/>
         </w:rPr>
-        <w:t xml:space="preserve"> are the prostate slices with the lowest dice scores across all the test scans. </w:t>
+        <w:t xml:space="preserve">. These five </w:t>
       </w:r>
       <w:r>
         <w:rPr>
@@ -4597,7 +5084,7 @@
           <w:lang w:eastAsia="en-AU"/>
           <w14:ligatures w14:val="none"/>
         </w:rPr>
-        <w:t>The images</w:t>
+        <w:t>failures</w:t>
       </w:r>
       <w:r>
         <w:rPr>
@@ -4606,7 +5093,7 @@
           <w:lang w:eastAsia="en-AU"/>
           <w14:ligatures w14:val="none"/>
         </w:rPr>
-        <w:t xml:space="preserve"> </w:t>
+        <w:t xml:space="preserve"> are the prostate slices with the lowest </w:t>
       </w:r>
       <w:r>
         <w:rPr>
@@ -4615,7 +5102,7 @@
           <w:lang w:eastAsia="en-AU"/>
           <w14:ligatures w14:val="none"/>
         </w:rPr>
-        <w:t>compar</w:t>
+        <w:t>D</w:t>
       </w:r>
       <w:r>
         <w:rPr>
@@ -4624,7 +5111,7 @@
           <w:lang w:eastAsia="en-AU"/>
           <w14:ligatures w14:val="none"/>
         </w:rPr>
-        <w:t>e</w:t>
+        <w:t xml:space="preserve">ice scores across all the test scans. </w:t>
       </w:r>
       <w:r>
         <w:rPr>
@@ -4633,7 +5120,7 @@
           <w:lang w:eastAsia="en-AU"/>
           <w14:ligatures w14:val="none"/>
         </w:rPr>
-        <w:t xml:space="preserve"> the input image, ground truth mask, predict</w:t>
+        <w:t>The images</w:t>
       </w:r>
       <w:r>
         <w:rPr>
@@ -4642,7 +5129,7 @@
           <w:lang w:eastAsia="en-AU"/>
           <w14:ligatures w14:val="none"/>
         </w:rPr>
-        <w:t>ed</w:t>
+        <w:t xml:space="preserve"> </w:t>
       </w:r>
       <w:r>
         <w:rPr>
@@ -4651,7 +5138,7 @@
           <w:lang w:eastAsia="en-AU"/>
           <w14:ligatures w14:val="none"/>
         </w:rPr>
-        <w:t xml:space="preserve"> mask and </w:t>
+        <w:t>compar</w:t>
       </w:r>
       <w:r>
         <w:rPr>
@@ -4660,7 +5147,7 @@
           <w:lang w:eastAsia="en-AU"/>
           <w14:ligatures w14:val="none"/>
         </w:rPr>
-        <w:t>a</w:t>
+        <w:t>e</w:t>
       </w:r>
       <w:r>
         <w:rPr>
@@ -4669,7 +5156,7 @@
           <w:lang w:eastAsia="en-AU"/>
           <w14:ligatures w14:val="none"/>
         </w:rPr>
-        <w:t>n error overlay with false positives in red and false negatives in blu</w:t>
+        <w:t xml:space="preserve"> the input image, ground truth mask, predict</w:t>
       </w:r>
       <w:r>
         <w:rPr>
@@ -4678,7 +5165,7 @@
           <w:lang w:eastAsia="en-AU"/>
           <w14:ligatures w14:val="none"/>
         </w:rPr>
-        <w:t>e</w:t>
+        <w:t>ed</w:t>
       </w:r>
       <w:r>
         <w:rPr>
@@ -4687,7 +5174,7 @@
           <w:lang w:eastAsia="en-AU"/>
           <w14:ligatures w14:val="none"/>
         </w:rPr>
-        <w:t xml:space="preserve">. </w:t>
+        <w:t xml:space="preserve"> mask and </w:t>
       </w:r>
       <w:r>
         <w:rPr>
@@ -4696,7 +5183,7 @@
           <w:lang w:eastAsia="en-AU"/>
           <w14:ligatures w14:val="none"/>
         </w:rPr>
-        <w:t>These</w:t>
+        <w:t>a</w:t>
       </w:r>
       <w:r>
         <w:rPr>
@@ -4705,7 +5192,7 @@
           <w:lang w:eastAsia="en-AU"/>
           <w14:ligatures w14:val="none"/>
         </w:rPr>
-        <w:t xml:space="preserve"> </w:t>
+        <w:t>n error overlay with false positives in red and false negatives in blu</w:t>
       </w:r>
       <w:r>
         <w:rPr>
@@ -4714,7 +5201,7 @@
           <w:lang w:eastAsia="en-AU"/>
           <w14:ligatures w14:val="none"/>
         </w:rPr>
-        <w:t>five</w:t>
+        <w:t>e</w:t>
       </w:r>
       <w:r>
         <w:rPr>
@@ -4723,7 +5210,7 @@
           <w:lang w:eastAsia="en-AU"/>
           <w14:ligatures w14:val="none"/>
         </w:rPr>
-        <w:t xml:space="preserve"> worst failure causes demonstrate a consistent under contouring of the prostate </w:t>
+        <w:t xml:space="preserve">. </w:t>
       </w:r>
       <w:r>
         <w:rPr>
@@ -4732,7 +5219,7 @@
           <w:lang w:eastAsia="en-AU"/>
           <w14:ligatures w14:val="none"/>
         </w:rPr>
-        <w:t>at the apex</w:t>
+        <w:t>These</w:t>
       </w:r>
       <w:r>
         <w:rPr>
@@ -4750,7 +5237,7 @@
           <w:lang w:eastAsia="en-AU"/>
           <w14:ligatures w14:val="none"/>
         </w:rPr>
-        <w:t>specifically</w:t>
+        <w:t>five</w:t>
       </w:r>
       <w:r>
         <w:rPr>
@@ -4759,7 +5246,7 @@
           <w:lang w:eastAsia="en-AU"/>
           <w14:ligatures w14:val="none"/>
         </w:rPr>
-        <w:t xml:space="preserve">. </w:t>
+        <w:t xml:space="preserve"> worst failure causes demonstrate a consistent under</w:t>
       </w:r>
       <w:r>
         <w:rPr>
@@ -4768,7 +5255,7 @@
           <w:lang w:eastAsia="en-AU"/>
           <w14:ligatures w14:val="none"/>
         </w:rPr>
-        <w:t>All five cases were false negatives at the prostate apex. Three were consecutive slices from one patient (case 42, slices 51–53), with the remaining two from cases 41 and 40 (slices 59 and 60).</w:t>
+        <w:t>-</w:t>
       </w:r>
       <w:r>
         <w:rPr>
@@ -4777,18 +5264,17 @@
           <w:lang w:eastAsia="en-AU"/>
           <w14:ligatures w14:val="none"/>
         </w:rPr>
-        <w:t xml:space="preserve"> </w:t>
-      </w:r>
-    </w:p>
-    <w:p>
-      <w:pPr>
+        <w:t xml:space="preserve">contouring of the prostate </w:t>
+      </w:r>
+      <w:r>
         <w:rPr>
           <w:rFonts w:eastAsia="Times New Roman" w:cs="Times New Roman"/>
           <w:kern w:val="0"/>
           <w:lang w:eastAsia="en-AU"/>
           <w14:ligatures w14:val="none"/>
         </w:rPr>
-      </w:pPr>
+        <w:t>at the apex</w:t>
+      </w:r>
       <w:r>
         <w:rPr>
           <w:rFonts w:eastAsia="Times New Roman" w:cs="Times New Roman"/>
@@ -4796,7 +5282,7 @@
           <w:lang w:eastAsia="en-AU"/>
           <w14:ligatures w14:val="none"/>
         </w:rPr>
-        <w:t xml:space="preserve">Therefore, whilst the model has demonstrated an improvement in prostate identification at these boundary failure regions, </w:t>
+        <w:t xml:space="preserve"> </w:t>
       </w:r>
       <w:r>
         <w:rPr>
@@ -4805,7 +5291,7 @@
           <w:lang w:eastAsia="en-AU"/>
           <w14:ligatures w14:val="none"/>
         </w:rPr>
-        <w:t xml:space="preserve">the model still recorded </w:t>
+        <w:t>specifically</w:t>
       </w:r>
       <w:r>
         <w:rPr>
@@ -4814,7 +5300,7 @@
           <w:lang w:eastAsia="en-AU"/>
           <w14:ligatures w14:val="none"/>
         </w:rPr>
-        <w:t xml:space="preserve">some </w:t>
+        <w:t xml:space="preserve">. </w:t>
       </w:r>
       <w:r>
         <w:rPr>
@@ -4823,7 +5309,7 @@
           <w:lang w:eastAsia="en-AU"/>
           <w14:ligatures w14:val="none"/>
         </w:rPr>
-        <w:t xml:space="preserve">false negative identifications. </w:t>
+        <w:t>All five cases were false negatives at the prostate apex. Three were consecutive slices from one patient (case 42, slices 51–53), with the remaining two from cases 41 and 40 (slices 59 and 60).</w:t>
       </w:r>
       <w:r>
         <w:rPr>
@@ -4832,17 +5318,18 @@
           <w:lang w:eastAsia="en-AU"/>
           <w14:ligatures w14:val="none"/>
         </w:rPr>
-        <w:t>This indicates a reduced</w:t>
-      </w:r>
-      <w:r>
+        <w:t xml:space="preserve"> </w:t>
+      </w:r>
+    </w:p>
+    <w:p>
+      <w:pPr>
         <w:rPr>
           <w:rFonts w:eastAsia="Times New Roman" w:cs="Times New Roman"/>
           <w:kern w:val="0"/>
           <w:lang w:eastAsia="en-AU"/>
           <w14:ligatures w14:val="none"/>
         </w:rPr>
-        <w:t>, but still</w:t>
-      </w:r>
+      </w:pPr>
       <w:r>
         <w:rPr>
           <w:rFonts w:eastAsia="Times New Roman" w:cs="Times New Roman"/>
@@ -4850,7 +5337,7 @@
           <w:lang w:eastAsia="en-AU"/>
           <w14:ligatures w14:val="none"/>
         </w:rPr>
-        <w:t xml:space="preserve"> ongoing risk of </w:t>
+        <w:t xml:space="preserve">Therefore, whilst the model has demonstrated an improvement in prostate identification at these boundary failure regions, </w:t>
       </w:r>
       <w:r>
         <w:rPr>
@@ -4859,7 +5346,79 @@
           <w:lang w:eastAsia="en-AU"/>
           <w14:ligatures w14:val="none"/>
         </w:rPr>
-        <w:t xml:space="preserve">under contouring and therefore introduces </w:t>
+        <w:t xml:space="preserve">the model still recorded </w:t>
+      </w:r>
+      <w:r>
+        <w:rPr>
+          <w:rFonts w:eastAsia="Times New Roman" w:cs="Times New Roman"/>
+          <w:kern w:val="0"/>
+          <w:lang w:eastAsia="en-AU"/>
+          <w14:ligatures w14:val="none"/>
+        </w:rPr>
+        <w:t xml:space="preserve">some </w:t>
+      </w:r>
+      <w:r>
+        <w:rPr>
+          <w:rFonts w:eastAsia="Times New Roman" w:cs="Times New Roman"/>
+          <w:kern w:val="0"/>
+          <w:lang w:eastAsia="en-AU"/>
+          <w14:ligatures w14:val="none"/>
+        </w:rPr>
+        <w:t xml:space="preserve">false negative identifications. </w:t>
+      </w:r>
+      <w:r>
+        <w:rPr>
+          <w:rFonts w:eastAsia="Times New Roman" w:cs="Times New Roman"/>
+          <w:kern w:val="0"/>
+          <w:lang w:eastAsia="en-AU"/>
+          <w14:ligatures w14:val="none"/>
+        </w:rPr>
+        <w:t>This indicates a reduced</w:t>
+      </w:r>
+      <w:r>
+        <w:rPr>
+          <w:rFonts w:eastAsia="Times New Roman" w:cs="Times New Roman"/>
+          <w:kern w:val="0"/>
+          <w:lang w:eastAsia="en-AU"/>
+          <w14:ligatures w14:val="none"/>
+        </w:rPr>
+        <w:t>, but still</w:t>
+      </w:r>
+      <w:r>
+        <w:rPr>
+          <w:rFonts w:eastAsia="Times New Roman" w:cs="Times New Roman"/>
+          <w:kern w:val="0"/>
+          <w:lang w:eastAsia="en-AU"/>
+          <w14:ligatures w14:val="none"/>
+        </w:rPr>
+        <w:t xml:space="preserve"> ongoing risk of </w:t>
+      </w:r>
+      <w:r>
+        <w:rPr>
+          <w:rFonts w:eastAsia="Times New Roman" w:cs="Times New Roman"/>
+          <w:kern w:val="0"/>
+          <w:lang w:eastAsia="en-AU"/>
+          <w14:ligatures w14:val="none"/>
+        </w:rPr>
+        <w:t>under</w:t>
+      </w:r>
+      <w:r>
+        <w:rPr>
+          <w:rFonts w:eastAsia="Times New Roman" w:cs="Times New Roman"/>
+          <w:kern w:val="0"/>
+          <w:lang w:eastAsia="en-AU"/>
+          <w14:ligatures w14:val="none"/>
+        </w:rPr>
+        <w:t>-</w:t>
+      </w:r>
+      <w:r>
+        <w:rPr>
+          <w:rFonts w:eastAsia="Times New Roman" w:cs="Times New Roman"/>
+          <w:kern w:val="0"/>
+          <w:lang w:eastAsia="en-AU"/>
+          <w14:ligatures w14:val="none"/>
+        </w:rPr>
+        <w:t xml:space="preserve">contouring and therefore introduces </w:t>
       </w:r>
       <w:r>
         <w:rPr>
@@ -4889,49 +5448,147 @@
         </w:numPr>
       </w:pPr>
       <w:r>
-        <w:t>Recommendations</w:t>
-      </w:r>
-    </w:p>
-    <w:p>
-      <w:r>
-        <w:rPr>
-          <w:noProof/>
-        </w:rPr>
-        <w:drawing>
-          <wp:inline distT="0" distB="0" distL="0" distR="0" wp14:anchorId="36E09D7F" wp14:editId="45C26C8A">
-            <wp:extent cx="5731510" cy="170815"/>
-            <wp:effectExtent l="0" t="0" r="2540" b="635"/>
-            <wp:docPr id="438387477" name="Picture 1"/>
-            <wp:cNvGraphicFramePr>
-              <a:graphicFrameLocks xmlns:a="http://schemas.openxmlformats.org/drawingml/2006/main" noChangeAspect="1"/>
-            </wp:cNvGraphicFramePr>
-            <a:graphic xmlns:a="http://schemas.openxmlformats.org/drawingml/2006/main">
-              <a:graphicData uri="http://schemas.openxmlformats.org/drawingml/2006/picture">
-                <pic:pic xmlns:pic="http://schemas.openxmlformats.org/drawingml/2006/picture">
-                  <pic:nvPicPr>
-                    <pic:cNvPr id="438387477" name=""/>
-                    <pic:cNvPicPr/>
-                  </pic:nvPicPr>
-                  <pic:blipFill>
-                    <a:blip r:embed="rId9"/>
-                    <a:stretch>
-                      <a:fillRect/>
-                    </a:stretch>
-                  </pic:blipFill>
-                  <pic:spPr>
-                    <a:xfrm>
-                      <a:off x="0" y="0"/>
-                      <a:ext cx="5731510" cy="170815"/>
-                    </a:xfrm>
-                    <a:prstGeom prst="rect">
-                      <a:avLst/>
-                    </a:prstGeom>
-                  </pic:spPr>
-                </pic:pic>
-              </a:graphicData>
-            </a:graphic>
-          </wp:inline>
-        </w:drawing>
+        <w:lastRenderedPageBreak/>
+        <w:t>Conclusions</w:t>
+      </w:r>
+    </w:p>
+    <w:p>
+      <w:r>
+        <w:t xml:space="preserve">Therefore, this investigation suggests that in prostate radiotherapy planning, the 3D Improved U-Net model provides </w:t>
+      </w:r>
+      <w:r>
+        <w:t xml:space="preserve">a substantial improvement in the standard global </w:t>
+      </w:r>
+      <w:r>
+        <w:t>Sorensen</w:t>
+      </w:r>
+      <w:r>
+        <w:t xml:space="preserve">-Dice </w:t>
+      </w:r>
+      <w:r>
+        <w:t>similarity</w:t>
+      </w:r>
+      <w:r>
+        <w:t xml:space="preserve"> coefficient</w:t>
+      </w:r>
+      <w:r>
+        <w:t xml:space="preserve">s, with </w:t>
+      </w:r>
+      <w:r>
+        <w:t xml:space="preserve">significant improvement in performance at superior (base) and inferior (apex) slices. </w:t>
+      </w:r>
+      <w:r>
+        <w:t>The baseline and improved 3</w:t>
+      </w:r>
+      <w:r>
+        <w:t>D</w:t>
+      </w:r>
+      <w:r>
+        <w:t xml:space="preserve"> model recorded similar </w:t>
+      </w:r>
+      <w:r>
+        <w:t>D</w:t>
+      </w:r>
+      <w:r>
+        <w:t xml:space="preserve">ice scores on the prostate label on the test set, </w:t>
+      </w:r>
+      <w:r>
+        <w:t xml:space="preserve">exceeding the target </w:t>
+      </w:r>
+      <w:r>
+        <w:t>D</w:t>
+      </w:r>
+      <w:r>
+        <w:t xml:space="preserve">ice scores </w:t>
+      </w:r>
+      <w:r>
+        <w:t xml:space="preserve">of </w:t>
+      </w:r>
+      <m:oMath>
+        <m:r>
+          <w:rPr>
+            <w:rFonts w:ascii="Cambria Math" w:hAnsi="Cambria Math"/>
+          </w:rPr>
+          <m:t>≥0.75</m:t>
+        </m:r>
+      </m:oMath>
+      <w:r>
+        <w:rPr>
+          <w:rFonts w:eastAsiaTheme="minorEastAsia"/>
+        </w:rPr>
+        <w:t xml:space="preserve"> for the baseline mode, and </w:t>
+      </w:r>
+      <m:oMath>
+        <m:r>
+          <w:rPr>
+            <w:rFonts w:ascii="Cambria Math" w:eastAsiaTheme="minorEastAsia" w:hAnsi="Cambria Math"/>
+          </w:rPr>
+          <m:t>≥0.70</m:t>
+        </m:r>
+      </m:oMath>
+      <w:r>
+        <w:rPr>
+          <w:rFonts w:eastAsiaTheme="minorEastAsia"/>
+        </w:rPr>
+        <w:t xml:space="preserve"> for the improved model. </w:t>
+      </w:r>
+    </w:p>
+    <w:p>
+      <w:r>
+        <w:t>However, most notably, t</w:t>
+      </w:r>
+      <w:r>
+        <w:t>he baseline model</w:t>
+      </w:r>
+      <w:r>
+        <w:t xml:space="preserve"> recorded 0.525 and 0.440</w:t>
+      </w:r>
+      <w:r>
+        <w:t xml:space="preserve"> </w:t>
+      </w:r>
+      <w:r>
+        <w:t>D</w:t>
+      </w:r>
+      <w:r>
+        <w:t xml:space="preserve">ice scores at </w:t>
+      </w:r>
+      <w:r>
+        <w:t>the critical boundary</w:t>
+      </w:r>
+      <w:r>
+        <w:t xml:space="preserve"> slices, whilst the 3D improved model recorded </w:t>
+      </w:r>
+      <w:r>
+        <w:t>D</w:t>
+      </w:r>
+      <w:r>
+        <w:t xml:space="preserve">ice scores of 0.697 and 0.725. </w:t>
+      </w:r>
+      <w:r>
+        <w:t xml:space="preserve">This is a significant improvement in performance at these hazardous boundary slices. Whilst the baseline model greatly over and under contours the prostate region, the 3D model is able to </w:t>
+      </w:r>
+      <w:r>
+        <w:t>accurately</w:t>
+      </w:r>
+      <w:r>
+        <w:t xml:space="preserve"> delineate the prostate from other critical organs at risk</w:t>
+      </w:r>
+      <w:r>
+        <w:t xml:space="preserve">. </w:t>
+      </w:r>
+    </w:p>
+    <w:p>
+      <w:r>
+        <w:t>The 3D Improved U-Net delivers a measurable clinical gain in identify</w:t>
+      </w:r>
+      <w:r>
+        <w:t>ing</w:t>
+      </w:r>
+      <w:r>
+        <w:t xml:space="preserve"> the prostate</w:t>
+      </w:r>
+      <w:r>
+        <w:t xml:space="preserve">, and despite an increase in GPU memory and training time, the improvement outweighs the additional computational budget. </w:t>
       </w:r>
     </w:p>
     <w:p/>
@@ -4956,10 +5613,16 @@
         <w:t xml:space="preserve">Appendix 8.1: </w:t>
       </w:r>
       <w:r>
-        <w:t>Failures</w:t>
-      </w:r>
-      <w:r>
-        <w:t xml:space="preserve"> Causes for Base Model</w:t>
+        <w:t>Failure</w:t>
+      </w:r>
+      <w:r>
+        <w:t xml:space="preserve"> </w:t>
+      </w:r>
+      <w:r>
+        <w:t>Cases</w:t>
+      </w:r>
+      <w:r>
+        <w:t xml:space="preserve"> for Base Model</w:t>
       </w:r>
     </w:p>
     <w:p>
@@ -4968,9 +5631,9 @@
           <w:noProof/>
         </w:rPr>
         <w:drawing>
-          <wp:inline distT="0" distB="0" distL="0" distR="0" wp14:anchorId="375C8E56" wp14:editId="13FE0991">
-            <wp:extent cx="4368758" cy="5825173"/>
-            <wp:effectExtent l="0" t="0" r="0" b="4445"/>
+          <wp:inline distT="0" distB="0" distL="0" distR="0" wp14:anchorId="375C8E56" wp14:editId="5919A219">
+            <wp:extent cx="5009183" cy="6679096"/>
+            <wp:effectExtent l="0" t="0" r="1270" b="7620"/>
             <wp:docPr id="237119836" name="Picture 4"/>
             <wp:cNvGraphicFramePr>
               <a:graphicFrameLocks xmlns:a="http://schemas.openxmlformats.org/drawingml/2006/main" noChangeAspect="1"/>
@@ -4985,7 +5648,7 @@
                     </pic:cNvPicPr>
                   </pic:nvPicPr>
                   <pic:blipFill>
-                    <a:blip r:embed="rId10" cstate="print">
+                    <a:blip r:embed="rId9" cstate="print">
                       <a:extLst>
                         <a:ext uri="{28A0092B-C50C-407E-A947-70E740481C1C}">
                           <a14:useLocalDpi xmlns:a14="http://schemas.microsoft.com/office/drawing/2010/main" val="0"/>
@@ -5000,7 +5663,7 @@
                   <pic:spPr bwMode="auto">
                     <a:xfrm>
                       <a:off x="0" y="0"/>
-                      <a:ext cx="4384419" cy="5846055"/>
+                      <a:ext cx="5030698" cy="6707784"/>
                     </a:xfrm>
                     <a:prstGeom prst="rect">
                       <a:avLst/>
@@ -5023,7 +5686,19 @@
       </w:pPr>
       <w:r>
         <w:lastRenderedPageBreak/>
-        <w:t>Appendix 8.2: Failures Causes for Improved U-Net Model</w:t>
+        <w:t>Appendix 8.2: Failur</w:t>
+      </w:r>
+      <w:r>
+        <w:t>e</w:t>
+      </w:r>
+      <w:r>
+        <w:t xml:space="preserve"> </w:t>
+      </w:r>
+      <w:r>
+        <w:t>Cases</w:t>
+      </w:r>
+      <w:r>
+        <w:t xml:space="preserve"> for Improved U-Net Model</w:t>
       </w:r>
     </w:p>
     <w:p>
@@ -5049,7 +5724,7 @@
                     </pic:cNvPicPr>
                   </pic:nvPicPr>
                   <pic:blipFill>
-                    <a:blip r:embed="rId11" cstate="print">
+                    <a:blip r:embed="rId10" cstate="print">
                       <a:extLst>
                         <a:ext uri="{28A0092B-C50C-407E-A947-70E740481C1C}">
                           <a14:useLocalDpi xmlns:a14="http://schemas.microsoft.com/office/drawing/2010/main" val="0"/>

</xml_diff>

<commit_message>
Finished report.docx changes, and moved to readme
</commit_message>
<xml_diff>
--- a/recognition/UNet_HipMRI_s48028293/Report.docx
+++ b/recognition/UNet_HipMRI_s48028293/Report.docx
@@ -1388,7 +1388,13 @@
         <w:t>N</w:t>
       </w:r>
       <w:r>
-        <w:t xml:space="preserve">et models. Both sets recorded no data leakage, identical test sets and an </w:t>
+        <w:t xml:space="preserve">et models. </w:t>
+      </w:r>
+      <w:r>
+        <w:t xml:space="preserve">The 2D split provided was used as a base for splitting the 3D dataset identically for accurate model comparison. </w:t>
+      </w:r>
+      <w:r>
+        <w:t xml:space="preserve">Both sets recorded no data leakage, identical test sets and an </w:t>
       </w:r>
       <w:r>
         <w:t>appropriate split</w:t>
@@ -1468,6 +1474,7 @@
         </w:numPr>
       </w:pPr>
       <w:r>
+        <w:lastRenderedPageBreak/>
         <w:t>Splitting: Split the 3d dataset in accordance with the 2D splitting</w:t>
       </w:r>
       <w:r>
@@ -1483,7 +1490,6 @@
         </w:numPr>
       </w:pPr>
       <w:r>
-        <w:lastRenderedPageBreak/>
         <w:t xml:space="preserve">Down sampling: </w:t>
       </w:r>
       <w:r>
@@ -2129,7 +2135,7 @@
           <w:noProof/>
         </w:rPr>
         <w:drawing>
-          <wp:inline distT="0" distB="0" distL="0" distR="0" wp14:anchorId="257C2F4A" wp14:editId="2C88AA23">
+          <wp:inline distT="0" distB="0" distL="0" distR="0" wp14:anchorId="257C2F4A" wp14:editId="4F60C7A7">
             <wp:extent cx="4026537" cy="2301006"/>
             <wp:effectExtent l="0" t="0" r="0" b="4445"/>
             <wp:docPr id="562946213" name="Picture 2"/>
@@ -2397,7 +2403,7 @@
           <w:noProof/>
         </w:rPr>
         <w:drawing>
-          <wp:inline distT="0" distB="0" distL="0" distR="0" wp14:anchorId="48E4354E" wp14:editId="785D40B7">
+          <wp:inline distT="0" distB="0" distL="0" distR="0" wp14:anchorId="48E4354E" wp14:editId="647AA034">
             <wp:extent cx="4033831" cy="2305174"/>
             <wp:effectExtent l="0" t="0" r="5080" b="0"/>
             <wp:docPr id="846199533" name="Picture 8"/>
@@ -5768,7 +5774,96 @@
         <w:t>Artificial Intelligence Usage Disclosure</w:t>
       </w:r>
     </w:p>
-    <w:p/>
+    <w:p>
+      <w:r>
+        <w:rPr>
+          <w:b/>
+          <w:bCs/>
+        </w:rPr>
+        <w:t>AI Tool Used:</w:t>
+      </w:r>
+      <w:r>
+        <w:t xml:space="preserve"> Claude</w:t>
+      </w:r>
+    </w:p>
+    <w:p>
+      <w:pPr>
+        <w:rPr>
+          <w:b/>
+          <w:bCs/>
+        </w:rPr>
+      </w:pPr>
+      <w:r>
+        <w:rPr>
+          <w:b/>
+          <w:bCs/>
+        </w:rPr>
+        <w:t>What specific tasks AI assisted with:</w:t>
+      </w:r>
+    </w:p>
+    <w:p>
+      <w:r>
+        <w:t>AI was used to</w:t>
+      </w:r>
+      <w:r>
+        <w:t xml:space="preserve"> suggest code on how to extend my exist 2D U-Net to a 3D and improved 3D U-Net model. </w:t>
+      </w:r>
+      <w:r>
+        <w:t xml:space="preserve">It was also used to debug errors and </w:t>
+      </w:r>
+      <w:r>
+        <w:t xml:space="preserve">help format the README file. </w:t>
+      </w:r>
+    </w:p>
+    <w:p>
+      <w:pPr>
+        <w:rPr>
+          <w:b/>
+          <w:bCs/>
+        </w:rPr>
+      </w:pPr>
+      <w:r>
+        <w:rPr>
+          <w:b/>
+          <w:bCs/>
+        </w:rPr>
+        <w:t>How you audited, verified and empirically tested the AI suggested code:</w:t>
+      </w:r>
+    </w:p>
+    <w:p>
+      <w:r>
+        <w:t>I</w:t>
+      </w:r>
+      <w:r>
+        <w:rPr>
+          <w:b/>
+          <w:bCs/>
+        </w:rPr>
+        <w:t xml:space="preserve"> </w:t>
+      </w:r>
+      <w:r>
+        <w:t>reviewed all suggested code</w:t>
+      </w:r>
+      <w:r>
+        <w:t xml:space="preserve">, confirming the patient-level split, leakage and U-Net model structure. </w:t>
+      </w:r>
+      <w:r>
+        <w:t xml:space="preserve">I made changes gradually, testing each improvement before moving on to ensure </w:t>
+      </w:r>
+      <w:r>
+        <w:lastRenderedPageBreak/>
+        <w:t>the code was working correctly.</w:t>
+      </w:r>
+      <w:r>
+        <w:t xml:space="preserve"> </w:t>
+      </w:r>
+      <w:r>
+        <w:t xml:space="preserve">The experimental design, analysis and conclusions </w:t>
+      </w:r>
+      <w:r>
+        <w:t>were completed independently of AI.</w:t>
+      </w:r>
+    </w:p>
     <w:sectPr>
       <w:pgSz w:w="11906" w:h="16838"/>
       <w:pgMar w:top="1440" w:right="1440" w:bottom="1440" w:left="1440" w:header="708" w:footer="708" w:gutter="0"/>

</xml_diff>